<commit_message>
vpscreen-rerank: 17 deep-dive stocks retiered (Univastu/Zinka/RNIT -> tierB, Devson -> screenedOut, Golkunda -> highCaution); Confluence-100 rebuilt with 6 new symbol-map resolutions (Embassy REIT, Hero MotoCorp, Ipca Labs, Kaveri Seed, Powerica, Raghav Productivity), 92/100 technicals resolved
Co-Authored-By: Claude Sonnet 5 <noreply@anthropic.com>
</commit_message>
<xml_diff>
--- a/projects/valuepickr-open-screen/docs/00_SCREEN_RANKING.docx
+++ b/projects/valuepickr-open-screen/docs/00_SCREEN_RANKING.docx
@@ -2411,6 +2411,105 @@
     </w:p>
     <w:p>
       <w:pPr>
+        <w:spacing w:after="160"/>
+      </w:pPr>
+      <w:r>
+        <w:rPr>
+          <w:b/>
+          <w:bCs/>
+          <w:sz w:val="24"/>
+          <w:szCs w:val="24"/>
+        </w:rPr>
+        <w:t xml:space="preserve">67. RNIT AI Solutions Ltd</w:t>
+      </w:r>
+      <w:r>
+        <w:rPr>
+          <w:i/>
+          <w:iCs/>
+          <w:color w:val="666666"/>
+          <w:sz w:val="20"/>
+          <w:szCs w:val="20"/>
+        </w:rPr>
+        <w:t xml:space="preserve">  —  Govt facial-recognition SaaS microcap, ROCE 12%-&gt;20%, low leverage (0.13x)</w:t>
+      </w:r>
+      <w:r>
+        <w:rPr>
+          <w:sz w:val="20"/>
+          <w:szCs w:val="20"/>
+        </w:rPr>
+        <w:br/>
+        <w:t xml:space="preserve">
+Deep-dive pass 1 (2026-09-18): listed vehicle emerged from NCLT insolvency resolution (real operating history ~2yrs only). ROCE improved to ~20.2% (from ~12.2%), OPM to ~40% (from ~32%) - genuine fundamental improvement. Prior D/E ~5.0x figure was stale/mis-scaled - corrected to ~0.13x, genuinely low leverage. Two preferential allotments (~Rs47cr) drove a promoter-holding swing (52.28%-&gt;73.74%-&gt;67.42%) that reads as dilution, not selling. First non-government diversification (Aug-2026 1FC Technology fintech/wealthtech deal, Rs5-15cr, unproven at scale). Seasonal revenue pattern (Q4 govt year-end peak), elevated working capital (debtor days 146). four_box stays 3.0, thesis_fit 10x-in-2-3-years held. Conviction Medium (unchanged). [conviction_score 39.5]</w:t>
+      </w:r>
+    </w:p>
+    <w:p>
+      <w:pPr>
+        <w:spacing w:after="160"/>
+      </w:pPr>
+      <w:r>
+        <w:rPr>
+          <w:b/>
+          <w:bCs/>
+          <w:sz w:val="24"/>
+          <w:szCs w:val="24"/>
+        </w:rPr>
+        <w:t xml:space="preserve">68. Zinka Logistics Solutions Ltd (BlackBuck)</w:t>
+      </w:r>
+      <w:r>
+        <w:rPr>
+          <w:i/>
+          <w:iCs/>
+          <w:color w:val="666666"/>
+          <w:sz w:val="20"/>
+          <w:szCs w:val="20"/>
+        </w:rPr>
+        <w:t xml:space="preserve">  —  First full profitable FY (PAT Rs160cr), SuperLoads scaling ahead of guide</w:t>
+      </w:r>
+      <w:r>
+        <w:rPr>
+          <w:sz w:val="20"/>
+          <w:szCs w:val="20"/>
+        </w:rPr>
+        <w:br/>
+        <w:t xml:space="preserve">
+Deep-dive pass 1 (2026-09-18): FY26 was BlackBuck's first full profitable year (PAT Rs160cr, revenue +53% to Rs652cr, adj. EBITDA +84% to Rs190cr) after four straight loss-making years. SuperLoads scaling faster than guided (~50% QoQ, hit 14-city target on schedule, roughly halfway to 5,000-monthly-load goal). Correction: EBITDA margin actually compressing YoY (24.9% vs 29% Q1 FY27) on SuperLoads mix dilution, not expanding as previously assumed. Promoter holding fell 27.70%-&gt;25.05% over 4 quarters plus a confirmed Nov-2025 founder block deal (~2% stake); FII holding absorbed the supply (11.6%-&gt;32.5%). New Rs22cr tax dispute flagged in Q1 FY27 concall; FASTag-vs-GNSS regulatory transition still unresolved. Valuation de-rated ~84x -&gt; ~65-67x P/E as earnings caught up. Conviction Low-Medium -&gt; Medium. [conviction_score 43.9]</w:t>
+      </w:r>
+    </w:p>
+    <w:p>
+      <w:pPr>
+        <w:spacing w:after="160"/>
+      </w:pPr>
+      <w:r>
+        <w:rPr>
+          <w:b/>
+          <w:bCs/>
+          <w:sz w:val="24"/>
+          <w:szCs w:val="24"/>
+        </w:rPr>
+        <w:t xml:space="preserve">69. Univastu India</w:t>
+      </w:r>
+      <w:r>
+        <w:rPr>
+          <w:i/>
+          <w:iCs/>
+          <w:color w:val="666666"/>
+          <w:sz w:val="20"/>
+          <w:szCs w:val="20"/>
+        </w:rPr>
+        <w:t xml:space="preserve">  —  Rs1,021cr+ metro order book (4.2x FY26 revenue), ~37% revenue CAGR</w:t>
+      </w:r>
+      <w:r>
+        <w:rPr>
+          <w:sz w:val="20"/>
+          <w:szCs w:val="20"/>
+        </w:rPr>
+        <w:br/>
+        <w:t xml:space="preserve">
+Deep-dive pass 1 (2026-09-18) upgraded thesis_fit neither -&gt; 10x-in-2-3-years (four_box 2.5-&gt;3.5, moat and TAM re-scored on confirmed evidence): Rs1,021cr+ order book confirmed (L&amp;T Mumbai Metro Line4/4A Rs392cr, IRCON Mumbai Metro Rs485.67cr, Pune Metro Rs229.97cr/35% share). Revenue growth accelerating - FY22-26 CAGR ~37%, Q1 FY27 +252% YoY as the metro order book began executing. Real diversification optionality found (URBS Systems AB data-centre MOU, Univastu NUOS BMS/IoT JV, exclusive Myrtha Pools aquatics partnership). Multi-quarter promoter-holding decline (71.2%-&gt;64.24%) resolved as largely a promoter-participated Rs16cr warrant raise, not an exit signal. Serious caution: debtor days worsened to ~121, forcing a tripled borrowing limit (~Rs200cr) plus the warrant raise - growth is currently working-capital-funded, capping conviction at Medium. [conviction_score 48.5]</w:t>
+      </w:r>
+    </w:p>
+    <w:p>
+      <w:pPr>
         <w:pStyle w:val="Heading1"/>
         <w:spacing w:after="140" w:before="320"/>
       </w:pPr>
@@ -2449,7 +2548,7 @@
           <w:sz w:val="24"/>
           <w:szCs w:val="24"/>
         </w:rPr>
-        <w:t xml:space="preserve">67. 20 Microns : micronized to nano-sized minerals</w:t>
+        <w:t xml:space="preserve">70. 20 Microns : micronized to nano-sized minerals</w:t>
       </w:r>
       <w:r>
         <w:rPr>
@@ -2482,7 +2581,7 @@
           <w:sz w:val="24"/>
           <w:szCs w:val="24"/>
         </w:rPr>
-        <w:t xml:space="preserve">68. ASM Technologies</w:t>
+        <w:t xml:space="preserve">71. ASM Technologies</w:t>
       </w:r>
       <w:r>
         <w:rPr>
@@ -2515,7 +2614,7 @@
           <w:sz w:val="24"/>
           <w:szCs w:val="24"/>
         </w:rPr>
-        <w:t xml:space="preserve">69. Aarti Surfactants Ltd</w:t>
+        <w:t xml:space="preserve">72. Aarti Surfactants Ltd</w:t>
       </w:r>
       <w:r>
         <w:rPr>
@@ -2548,7 +2647,7 @@
           <w:sz w:val="24"/>
           <w:szCs w:val="24"/>
         </w:rPr>
-        <w:t xml:space="preserve">70. Accent Microcell Limited</w:t>
+        <w:t xml:space="preserve">73. Accent Microcell Limited</w:t>
       </w:r>
       <w:r>
         <w:rPr>
@@ -2581,7 +2680,7 @@
           <w:sz w:val="24"/>
           <w:szCs w:val="24"/>
         </w:rPr>
-        <w:t xml:space="preserve">71. Alufluoride Limited-conversion of waste into wealth</w:t>
+        <w:t xml:space="preserve">74. Alufluoride Limited-conversion of waste into wealth</w:t>
       </w:r>
       <w:r>
         <w:rPr>
@@ -2614,7 +2713,7 @@
           <w:sz w:val="24"/>
           <w:szCs w:val="24"/>
         </w:rPr>
-        <w:t xml:space="preserve">72. Archit Nuwood Industries</w:t>
+        <w:t xml:space="preserve">75. Archit Nuwood Industries</w:t>
       </w:r>
       <w:r>
         <w:rPr>
@@ -2647,7 +2746,7 @@
           <w:sz w:val="24"/>
           <w:szCs w:val="24"/>
         </w:rPr>
-        <w:t xml:space="preserve">73. Axiscades Engineering</w:t>
+        <w:t xml:space="preserve">76. Axiscades Engineering</w:t>
       </w:r>
       <w:r>
         <w:rPr>
@@ -2680,7 +2779,7 @@
           <w:sz w:val="24"/>
           <w:szCs w:val="24"/>
         </w:rPr>
-        <w:t xml:space="preserve">74. Bhadora Industries Ltd</w:t>
+        <w:t xml:space="preserve">77. Bhadora Industries Ltd</w:t>
       </w:r>
       <w:r>
         <w:rPr>
@@ -2713,7 +2812,7 @@
           <w:sz w:val="24"/>
           <w:szCs w:val="24"/>
         </w:rPr>
-        <w:t xml:space="preserve">75. Bondada Engineering Ltd</w:t>
+        <w:t xml:space="preserve">78. Bondada Engineering Ltd</w:t>
       </w:r>
       <w:r>
         <w:rPr>
@@ -2746,7 +2845,7 @@
           <w:sz w:val="24"/>
           <w:szCs w:val="24"/>
         </w:rPr>
-        <w:t xml:space="preserve">76. Borana Weaves</w:t>
+        <w:t xml:space="preserve">79. Borana Weaves</w:t>
       </w:r>
       <w:r>
         <w:rPr>
@@ -2779,7 +2878,7 @@
           <w:sz w:val="24"/>
           <w:szCs w:val="24"/>
         </w:rPr>
-        <w:t xml:space="preserve">77. COSMIC CRF LIMITED</w:t>
+        <w:t xml:space="preserve">80. COSMIC CRF LIMITED</w:t>
       </w:r>
       <w:r>
         <w:rPr>
@@ -2812,7 +2911,7 @@
           <w:sz w:val="24"/>
           <w:szCs w:val="24"/>
         </w:rPr>
-        <w:t xml:space="preserve">78. CSL Finance Limited</w:t>
+        <w:t xml:space="preserve">81. CSL Finance Limited</w:t>
       </w:r>
       <w:r>
         <w:rPr>
@@ -2845,7 +2944,7 @@
           <w:sz w:val="24"/>
           <w:szCs w:val="24"/>
         </w:rPr>
-        <w:t xml:space="preserve">79. Capacit'e Infraprojects</w:t>
+        <w:t xml:space="preserve">82. Capacit'e Infraprojects</w:t>
       </w:r>
       <w:r>
         <w:rPr>
@@ -2878,7 +2977,7 @@
           <w:sz w:val="24"/>
           <w:szCs w:val="24"/>
         </w:rPr>
-        <w:t xml:space="preserve">80. Chamunda Electricals Ltd</w:t>
+        <w:t xml:space="preserve">83. Chamunda Electricals Ltd</w:t>
       </w:r>
       <w:r>
         <w:rPr>
@@ -2911,7 +3010,7 @@
           <w:sz w:val="24"/>
           <w:szCs w:val="24"/>
         </w:rPr>
-        <w:t xml:space="preserve">81. Desco Infratech Ltd</w:t>
+        <w:t xml:space="preserve">84. Desco Infratech Ltd</w:t>
       </w:r>
       <w:r>
         <w:rPr>
@@ -2944,7 +3043,7 @@
           <w:sz w:val="24"/>
           <w:szCs w:val="24"/>
         </w:rPr>
-        <w:t xml:space="preserve">82. Devson Catalyst Ltd</w:t>
+        <w:t xml:space="preserve">85. Divgi TorqTransfer Systems Ltd</w:t>
       </w:r>
       <w:r>
         <w:rPr>
@@ -2977,7 +3076,7 @@
           <w:sz w:val="24"/>
           <w:szCs w:val="24"/>
         </w:rPr>
-        <w:t xml:space="preserve">83. Divgi TorqTransfer Systems Ltd</w:t>
+        <w:t xml:space="preserve">86. ESDS Software Solution Ltd</w:t>
       </w:r>
       <w:r>
         <w:rPr>
@@ -3010,7 +3109,7 @@
           <w:sz w:val="24"/>
           <w:szCs w:val="24"/>
         </w:rPr>
-        <w:t xml:space="preserve">84. ESDS Software Solution Ltd</w:t>
+        <w:t xml:space="preserve">87. Earkart Ltd</w:t>
       </w:r>
       <w:r>
         <w:rPr>
@@ -3043,7 +3142,7 @@
           <w:sz w:val="24"/>
           <w:szCs w:val="24"/>
         </w:rPr>
-        <w:t xml:space="preserve">85. Earkart Ltd</w:t>
+        <w:t xml:space="preserve">88. Eldeco Housing Ltd</w:t>
       </w:r>
       <w:r>
         <w:rPr>
@@ -3076,7 +3175,7 @@
           <w:sz w:val="24"/>
           <w:szCs w:val="24"/>
         </w:rPr>
-        <w:t xml:space="preserve">86. Eldeco Housing Ltd</w:t>
+        <w:t xml:space="preserve">89. Electronics Mart India Limited- EMIL</w:t>
       </w:r>
       <w:r>
         <w:rPr>
@@ -3109,7 +3208,7 @@
           <w:sz w:val="24"/>
           <w:szCs w:val="24"/>
         </w:rPr>
-        <w:t xml:space="preserve">87. Electronics Mart India Limited- EMIL</w:t>
+        <w:t xml:space="preserve">90. Emerald Finance</w:t>
       </w:r>
       <w:r>
         <w:rPr>
@@ -3142,7 +3241,7 @@
           <w:sz w:val="24"/>
           <w:szCs w:val="24"/>
         </w:rPr>
-        <w:t xml:space="preserve">88. Emerald Finance</w:t>
+        <w:t xml:space="preserve">91. Eppelton (EEPL)</w:t>
       </w:r>
       <w:r>
         <w:rPr>
@@ -3175,7 +3274,7 @@
           <w:sz w:val="24"/>
           <w:szCs w:val="24"/>
         </w:rPr>
-        <w:t xml:space="preserve">89. Eppelton (EEPL)</w:t>
+        <w:t xml:space="preserve">92. Freshara Agro Exports Ltd</w:t>
       </w:r>
       <w:r>
         <w:rPr>
@@ -3208,7 +3307,7 @@
           <w:sz w:val="24"/>
           <w:szCs w:val="24"/>
         </w:rPr>
-        <w:t xml:space="preserve">90. Freshara Agro Exports Ltd</w:t>
+        <w:t xml:space="preserve">93. GHCL Textiles Ltd</w:t>
       </w:r>
       <w:r>
         <w:rPr>
@@ -3241,7 +3340,7 @@
           <w:sz w:val="24"/>
           <w:szCs w:val="24"/>
         </w:rPr>
-        <w:t xml:space="preserve">91. GHCL Textiles Ltd</w:t>
+        <w:t xml:space="preserve">94. GV Electricals Ltd</w:t>
       </w:r>
       <w:r>
         <w:rPr>
@@ -3274,7 +3373,7 @@
           <w:sz w:val="24"/>
           <w:szCs w:val="24"/>
         </w:rPr>
-        <w:t xml:space="preserve">92. GV Electricals Ltd</w:t>
+        <w:t xml:space="preserve">95. Glen Industries Ltd</w:t>
       </w:r>
       <w:r>
         <w:rPr>
@@ -3307,7 +3406,7 @@
           <w:sz w:val="24"/>
           <w:szCs w:val="24"/>
         </w:rPr>
-        <w:t xml:space="preserve">93. Glen Industries Ltd</w:t>
+        <w:t xml:space="preserve">96. Hind Rectifiers Ltd (HIRECT)</w:t>
       </w:r>
       <w:r>
         <w:rPr>
@@ -3340,7 +3439,7 @@
           <w:sz w:val="24"/>
           <w:szCs w:val="24"/>
         </w:rPr>
-        <w:t xml:space="preserve">94. Hind Rectifiers Ltd (HIRECT)</w:t>
+        <w:t xml:space="preserve">97. I G Petrochemicals Ltd</w:t>
       </w:r>
       <w:r>
         <w:rPr>
@@ -3373,7 +3472,7 @@
           <w:sz w:val="24"/>
           <w:szCs w:val="24"/>
         </w:rPr>
-        <w:t xml:space="preserve">95. I G Petrochemicals Ltd</w:t>
+        <w:t xml:space="preserve">98. IZMO- bet on new technologies in Auto retail &amp; defence</w:t>
       </w:r>
       <w:r>
         <w:rPr>
@@ -3406,7 +3505,7 @@
           <w:sz w:val="24"/>
           <w:szCs w:val="24"/>
         </w:rPr>
-        <w:t xml:space="preserve">96. IZMO- bet on new technologies in Auto retail &amp; defence</w:t>
+        <w:t xml:space="preserve">99. Ideaforge technologies</w:t>
       </w:r>
       <w:r>
         <w:rPr>
@@ -3439,7 +3538,7 @@
           <w:sz w:val="24"/>
           <w:szCs w:val="24"/>
         </w:rPr>
-        <w:t xml:space="preserve">97. Ideaforge technologies</w:t>
+        <w:t xml:space="preserve">100. John Cockerill India: A Case Study on Decarbonisation of Steel</w:t>
       </w:r>
       <w:r>
         <w:rPr>
@@ -3472,7 +3571,7 @@
           <w:sz w:val="24"/>
           <w:szCs w:val="24"/>
         </w:rPr>
-        <w:t xml:space="preserve">98. John Cockerill India: A Case Study on Decarbonisation of Steel</w:t>
+        <w:t xml:space="preserve">101. KP Energy Ltd</w:t>
       </w:r>
       <w:r>
         <w:rPr>
@@ -3505,7 +3604,7 @@
           <w:sz w:val="24"/>
           <w:szCs w:val="24"/>
         </w:rPr>
-        <w:t xml:space="preserve">99. KP Energy Ltd</w:t>
+        <w:t xml:space="preserve">102. KP Green Engineering Ltd</w:t>
       </w:r>
       <w:r>
         <w:rPr>
@@ -3538,7 +3637,7 @@
           <w:sz w:val="24"/>
           <w:szCs w:val="24"/>
         </w:rPr>
-        <w:t xml:space="preserve">100. KP Green Engineering Ltd</w:t>
+        <w:t xml:space="preserve">103. KPI Green Energy Ltd</w:t>
       </w:r>
       <w:r>
         <w:rPr>
@@ -3571,7 +3670,7 @@
           <w:sz w:val="24"/>
           <w:szCs w:val="24"/>
         </w:rPr>
-        <w:t xml:space="preserve">101. KPI Green Energy Ltd</w:t>
+        <w:t xml:space="preserve">104. KRM Ayurveda Ltd</w:t>
       </w:r>
       <w:r>
         <w:rPr>
@@ -3604,7 +3703,7 @@
           <w:sz w:val="24"/>
           <w:szCs w:val="24"/>
         </w:rPr>
-        <w:t xml:space="preserve">102. KRM Ayurveda Ltd</w:t>
+        <w:t xml:space="preserve">105. Kamat Hotels (India) Ltd- A Possible Turnaround Story!</w:t>
       </w:r>
       <w:r>
         <w:rPr>
@@ -3637,7 +3736,7 @@
           <w:sz w:val="24"/>
           <w:szCs w:val="24"/>
         </w:rPr>
-        <w:t xml:space="preserve">103. Kamat Hotels (India) Ltd- A Possible Turnaround Story!</w:t>
+        <w:t xml:space="preserve">106. Kiri Industries: Loan reduction and demand surge</w:t>
       </w:r>
       <w:r>
         <w:rPr>
@@ -3670,7 +3769,7 @@
           <w:sz w:val="24"/>
           <w:szCs w:val="24"/>
         </w:rPr>
-        <w:t xml:space="preserve">104. Kiri Industries: Loan reduction and demand surge</w:t>
+        <w:t xml:space="preserve">107. Krishca Ltd : A SME offering steel strapping Solution</w:t>
       </w:r>
       <w:r>
         <w:rPr>
@@ -3703,7 +3802,7 @@
           <w:sz w:val="24"/>
           <w:szCs w:val="24"/>
         </w:rPr>
-        <w:t xml:space="preserve">105. Krishca Ltd : A SME offering steel strapping Solution</w:t>
+        <w:t xml:space="preserve">108. Kusumgar Ltd</w:t>
       </w:r>
       <w:r>
         <w:rPr>
@@ -3736,7 +3835,7 @@
           <w:sz w:val="24"/>
           <w:szCs w:val="24"/>
         </w:rPr>
-        <w:t xml:space="preserve">106. Kusumgar Ltd</w:t>
+        <w:t xml:space="preserve">109. Kwality Pharmaceuticals</w:t>
       </w:r>
       <w:r>
         <w:rPr>
@@ -3769,7 +3868,7 @@
           <w:sz w:val="24"/>
           <w:szCs w:val="24"/>
         </w:rPr>
-        <w:t xml:space="preserve">107. Kwality Pharmaceuticals</w:t>
+        <w:t xml:space="preserve">110. Laxmi Dental Ltd</w:t>
       </w:r>
       <w:r>
         <w:rPr>
@@ -3802,7 +3901,7 @@
           <w:sz w:val="24"/>
           <w:szCs w:val="24"/>
         </w:rPr>
-        <w:t xml:space="preserve">108. Laxmi Dental Ltd</w:t>
+        <w:t xml:space="preserve">111. MOIL Ltd</w:t>
       </w:r>
       <w:r>
         <w:rPr>
@@ -3835,7 +3934,7 @@
           <w:sz w:val="24"/>
           <w:szCs w:val="24"/>
         </w:rPr>
-        <w:t xml:space="preserve">109. MOIL Ltd</w:t>
+        <w:t xml:space="preserve">112. MV Electrosystems Ltd</w:t>
       </w:r>
       <w:r>
         <w:rPr>
@@ -3868,7 +3967,7 @@
           <w:sz w:val="24"/>
           <w:szCs w:val="24"/>
         </w:rPr>
-        <w:t xml:space="preserve">110. MV Electrosystems Ltd</w:t>
+        <w:t xml:space="preserve">113. Millworks Technologies Ltd</w:t>
       </w:r>
       <w:r>
         <w:rPr>
@@ -3901,7 +4000,7 @@
           <w:sz w:val="24"/>
           <w:szCs w:val="24"/>
         </w:rPr>
-        <w:t xml:space="preserve">111. Millworks Technologies Ltd</w:t>
+        <w:t xml:space="preserve">114. Mitsu Chem Plast Ltd</w:t>
       </w:r>
       <w:r>
         <w:rPr>
@@ -3934,7 +4033,7 @@
           <w:sz w:val="24"/>
           <w:szCs w:val="24"/>
         </w:rPr>
-        <w:t xml:space="preserve">112. Mitsu Chem Plast Ltd</w:t>
+        <w:t xml:space="preserve">115. Modern Insulators Ltd: A Porcelain Insulator Opportunity Insulating the Power Cycle while Riding India’s Transmission Boom</w:t>
       </w:r>
       <w:r>
         <w:rPr>
@@ -3967,7 +4066,7 @@
           <w:sz w:val="24"/>
           <w:szCs w:val="24"/>
         </w:rPr>
-        <w:t xml:space="preserve">113. Modern Insulators Ltd: A Porcelain Insulator Opportunity Insulating the Power Cycle while Riding India’s Transmission Boom</w:t>
+        <w:t xml:space="preserve">116. Morepen Labs</w:t>
       </w:r>
       <w:r>
         <w:rPr>
@@ -4000,7 +4099,7 @@
           <w:sz w:val="24"/>
           <w:szCs w:val="24"/>
         </w:rPr>
-        <w:t xml:space="preserve">114. Morepen Labs</w:t>
+        <w:t xml:space="preserve">117. Orchid Pharma Ltd</w:t>
       </w:r>
       <w:r>
         <w:rPr>
@@ -4033,7 +4132,7 @@
           <w:sz w:val="24"/>
           <w:szCs w:val="24"/>
         </w:rPr>
-        <w:t xml:space="preserve">115. Orchid Pharma Ltd</w:t>
+        <w:t xml:space="preserve">118. Oval Projects Engineering Ltd</w:t>
       </w:r>
       <w:r>
         <w:rPr>
@@ -4066,7 +4165,7 @@
           <w:sz w:val="24"/>
           <w:szCs w:val="24"/>
         </w:rPr>
-        <w:t xml:space="preserve">116. Oval Projects Engineering Ltd</w:t>
+        <w:t xml:space="preserve">119. P N Gadgil Jewellers Ltd</w:t>
       </w:r>
       <w:r>
         <w:rPr>
@@ -4099,7 +4198,7 @@
           <w:sz w:val="24"/>
           <w:szCs w:val="24"/>
         </w:rPr>
-        <w:t xml:space="preserve">117. P N Gadgil Jewellers Ltd</w:t>
+        <w:t xml:space="preserve">120. PNGS Gargi Fashion Jewellery Ltd</w:t>
       </w:r>
       <w:r>
         <w:rPr>
@@ -4132,7 +4231,7 @@
           <w:sz w:val="24"/>
           <w:szCs w:val="24"/>
         </w:rPr>
-        <w:t xml:space="preserve">118. PNGS Gargi Fashion Jewellery Ltd</w:t>
+        <w:t xml:space="preserve">121. Piccadily Agro Industries Ltd</w:t>
       </w:r>
       <w:r>
         <w:rPr>
@@ -4165,7 +4264,7 @@
           <w:sz w:val="24"/>
           <w:szCs w:val="24"/>
         </w:rPr>
-        <w:t xml:space="preserve">119. Piccadily Agro Industries Ltd</w:t>
+        <w:t xml:space="preserve">122. RBZ Jewellers Ltd</w:t>
       </w:r>
       <w:r>
         <w:rPr>
@@ -4198,7 +4297,7 @@
           <w:sz w:val="24"/>
           <w:szCs w:val="24"/>
         </w:rPr>
-        <w:t xml:space="preserve">120. RBZ Jewellers Ltd</w:t>
+        <w:t xml:space="preserve">123. RKEC Projects Ltd</w:t>
       </w:r>
       <w:r>
         <w:rPr>
@@ -4231,7 +4330,7 @@
           <w:sz w:val="24"/>
           <w:szCs w:val="24"/>
         </w:rPr>
-        <w:t xml:space="preserve">121. RKEC Projects Ltd</w:t>
+        <w:t xml:space="preserve">124. Rapicut Carbides Ltd.</w:t>
       </w:r>
       <w:r>
         <w:rPr>
@@ -4264,7 +4363,7 @@
           <w:sz w:val="24"/>
           <w:szCs w:val="24"/>
         </w:rPr>
-        <w:t xml:space="preserve">122. RNIT AI Solutions Ltd</w:t>
+        <w:t xml:space="preserve">125. Ratnaveer precision a newly headed steel company</w:t>
       </w:r>
       <w:r>
         <w:rPr>
@@ -4297,7 +4396,7 @@
           <w:sz w:val="24"/>
           <w:szCs w:val="24"/>
         </w:rPr>
-        <w:t xml:space="preserve">123. Rapicut Carbides Ltd.</w:t>
+        <w:t xml:space="preserve">126. Shalimar Paints Ltd. -- Worth a Serious Look -- Significant Rerating Triggers Inplace</w:t>
       </w:r>
       <w:r>
         <w:rPr>
@@ -4330,7 +4429,7 @@
           <w:sz w:val="24"/>
           <w:szCs w:val="24"/>
         </w:rPr>
-        <w:t xml:space="preserve">124. Ratnaveer precision a newly headed steel company</w:t>
+        <w:t xml:space="preserve">127. Shree Refrigerations</w:t>
       </w:r>
       <w:r>
         <w:rPr>
@@ -4363,7 +4462,7 @@
           <w:sz w:val="24"/>
           <w:szCs w:val="24"/>
         </w:rPr>
-        <w:t xml:space="preserve">125. Shalimar Paints Ltd. -- Worth a Serious Look -- Significant Rerating Triggers Inplace</w:t>
+        <w:t xml:space="preserve">128. Solarium Green Energy Ltd</w:t>
       </w:r>
       <w:r>
         <w:rPr>
@@ -4396,7 +4495,7 @@
           <w:sz w:val="24"/>
           <w:szCs w:val="24"/>
         </w:rPr>
-        <w:t xml:space="preserve">126. Shree Refrigerations</w:t>
+        <w:t xml:space="preserve">129. Solex Energy Ltd</w:t>
       </w:r>
       <w:r>
         <w:rPr>
@@ -4429,7 +4528,7 @@
           <w:sz w:val="24"/>
           <w:szCs w:val="24"/>
         </w:rPr>
-        <w:t xml:space="preserve">127. Solarium Green Energy Ltd</w:t>
+        <w:t xml:space="preserve">130. Sonu Infratech Ltd</w:t>
       </w:r>
       <w:r>
         <w:rPr>
@@ -4462,7 +4561,7 @@
           <w:sz w:val="24"/>
           <w:szCs w:val="24"/>
         </w:rPr>
-        <w:t xml:space="preserve">128. Solex Energy Ltd</w:t>
+        <w:t xml:space="preserve">131. Sri Lotus Developers</w:t>
       </w:r>
       <w:r>
         <w:rPr>
@@ -4495,7 +4594,7 @@
           <w:sz w:val="24"/>
           <w:szCs w:val="24"/>
         </w:rPr>
-        <w:t xml:space="preserve">129. Sonu Infratech Ltd</w:t>
+        <w:t xml:space="preserve">132. Susan Electricals India Ltd</w:t>
       </w:r>
       <w:r>
         <w:rPr>
@@ -4528,7 +4627,7 @@
           <w:sz w:val="24"/>
           <w:szCs w:val="24"/>
         </w:rPr>
-        <w:t xml:space="preserve">130. Sri Lotus Developers</w:t>
+        <w:t xml:space="preserve">133. Swastika Castal Ltd</w:t>
       </w:r>
       <w:r>
         <w:rPr>
@@ -4561,7 +4660,7 @@
           <w:sz w:val="24"/>
           <w:szCs w:val="24"/>
         </w:rPr>
-        <w:t xml:space="preserve">131. Susan Electricals India Ltd</w:t>
+        <w:t xml:space="preserve">134. Transrail Lighting Ltd</w:t>
       </w:r>
       <w:r>
         <w:rPr>
@@ -4594,7 +4693,7 @@
           <w:sz w:val="24"/>
           <w:szCs w:val="24"/>
         </w:rPr>
-        <w:t xml:space="preserve">132. Swastika Castal Ltd</w:t>
+        <w:t xml:space="preserve">135. TruAlt Bioenergy</w:t>
       </w:r>
       <w:r>
         <w:rPr>
@@ -4627,7 +4726,7 @@
           <w:sz w:val="24"/>
           <w:szCs w:val="24"/>
         </w:rPr>
-        <w:t xml:space="preserve">133. Transrail Lighting Ltd</w:t>
+        <w:t xml:space="preserve">136. Ugro Capital</w:t>
       </w:r>
       <w:r>
         <w:rPr>
@@ -4660,7 +4759,7 @@
           <w:sz w:val="24"/>
           <w:szCs w:val="24"/>
         </w:rPr>
-        <w:t xml:space="preserve">134. TruAlt Bioenergy</w:t>
+        <w:t xml:space="preserve">137. Unihealth Hospitals Ltd</w:t>
       </w:r>
       <w:r>
         <w:rPr>
@@ -4693,7 +4792,7 @@
           <w:sz w:val="24"/>
           <w:szCs w:val="24"/>
         </w:rPr>
-        <w:t xml:space="preserve">135. Ugro Capital</w:t>
+        <w:t xml:space="preserve">138. Vikram Solar- One of the oldest Solar module manufacturer</w:t>
       </w:r>
       <w:r>
         <w:rPr>
@@ -4726,7 +4825,7 @@
           <w:sz w:val="24"/>
           <w:szCs w:val="24"/>
         </w:rPr>
-        <w:t xml:space="preserve">136. Unihealth Hospitals Ltd</w:t>
+        <w:t xml:space="preserve">139. Walchandnagar Industries | Return of a Golden Era</w:t>
       </w:r>
       <w:r>
         <w:rPr>
@@ -4759,106 +4858,7 @@
           <w:sz w:val="24"/>
           <w:szCs w:val="24"/>
         </w:rPr>
-        <w:t xml:space="preserve">137. Vikram Solar- One of the oldest Solar module manufacturer</w:t>
-      </w:r>
-      <w:r>
-        <w:rPr>
-          <w:i/>
-          <w:iCs/>
-          <w:color w:val="666666"/>
-          <w:sz w:val="20"/>
-          <w:szCs w:val="20"/>
-        </w:rPr>
-        <w:t xml:space="preserve">  —  undefined</w:t>
-      </w:r>
-      <w:r>
-        <w:rPr>
-          <w:sz w:val="20"/>
-          <w:szCs w:val="20"/>
-        </w:rPr>
-        <w:br/>
-        <w:t xml:space="preserve">
-undefined</w:t>
-      </w:r>
-    </w:p>
-    <w:p>
-      <w:pPr>
-        <w:spacing w:after="160"/>
-      </w:pPr>
-      <w:r>
-        <w:rPr>
-          <w:b/>
-          <w:bCs/>
-          <w:sz w:val="24"/>
-          <w:szCs w:val="24"/>
-        </w:rPr>
-        <w:t xml:space="preserve">138. Walchandnagar Industries | Return of a Golden Era</w:t>
-      </w:r>
-      <w:r>
-        <w:rPr>
-          <w:i/>
-          <w:iCs/>
-          <w:color w:val="666666"/>
-          <w:sz w:val="20"/>
-          <w:szCs w:val="20"/>
-        </w:rPr>
-        <w:t xml:space="preserve">  —  undefined</w:t>
-      </w:r>
-      <w:r>
-        <w:rPr>
-          <w:sz w:val="20"/>
-          <w:szCs w:val="20"/>
-        </w:rPr>
-        <w:br/>
-        <w:t xml:space="preserve">
-undefined</w:t>
-      </w:r>
-    </w:p>
-    <w:p>
-      <w:pPr>
-        <w:spacing w:after="160"/>
-      </w:pPr>
-      <w:r>
-        <w:rPr>
-          <w:b/>
-          <w:bCs/>
-          <w:sz w:val="24"/>
-          <w:szCs w:val="24"/>
-        </w:rPr>
-        <w:t xml:space="preserve">139. Zaggle_A platform to address pain points for enterprises</w:t>
-      </w:r>
-      <w:r>
-        <w:rPr>
-          <w:i/>
-          <w:iCs/>
-          <w:color w:val="666666"/>
-          <w:sz w:val="20"/>
-          <w:szCs w:val="20"/>
-        </w:rPr>
-        <w:t xml:space="preserve">  —  undefined</w:t>
-      </w:r>
-      <w:r>
-        <w:rPr>
-          <w:sz w:val="20"/>
-          <w:szCs w:val="20"/>
-        </w:rPr>
-        <w:br/>
-        <w:t xml:space="preserve">
-undefined</w:t>
-      </w:r>
-    </w:p>
-    <w:p>
-      <w:pPr>
-        <w:spacing w:after="160"/>
-      </w:pPr>
-      <w:r>
-        <w:rPr>
-          <w:b/>
-          <w:bCs/>
-          <w:sz w:val="24"/>
-          <w:szCs w:val="24"/>
-        </w:rPr>
-        <w:t xml:space="preserve">140. Zinka Logistics Solutions Ltd (BlackBuck)</w:t>
+        <w:t xml:space="preserve">140. Zaggle_A platform to address pain points for enterprises</w:t>
       </w:r>
       <w:r>
         <w:rPr>
@@ -6972,6 +6972,37 @@
           </w:p>
         </w:tc>
       </w:tr>
+      <w:tr>
+        <w:tc>
+          <w:tcPr>
+            <w:tcW w:type="dxa" w:w="2600"/>
+          </w:tcPr>
+          <w:p>
+            <w:r>
+              <w:rPr>
+                <w:b/>
+                <w:bCs/>
+                <w:color w:val="B8860B"/>
+              </w:rPr>
+              <w:t xml:space="preserve">Golkunda Diamond</w:t>
+            </w:r>
+          </w:p>
+        </w:tc>
+        <w:tc>
+          <w:tcPr>
+            <w:tcW w:type="dxa" w:w="6400"/>
+          </w:tcPr>
+          <w:p>
+            <w:r>
+              <w:rPr>
+                <w:b w:val="false"/>
+                <w:bCs w:val="false"/>
+              </w:rPr>
+              <w:t xml:space="preserve">HIGH CAUTION (2026-09-18 deep dive): Infomerics placed Rs49cr bank facilities on Rating Watch-Negative (Apr-2026) citing WC pressure, high bank-limit utilisation, and ~85-90% Middle-East export concentration. Company raised Rs27.6cr via a dilutive preferential warrant issue (Jun-2026) explicitly earmarked partly for working capital - corroborates rather than resolves the rating flag. Promoter holding (72.8%) locked in to dilute to ~61.4% once warrants convert within 18mo. FY26 revenue growth only +11.5% (softer than the one strong Q1 FY27 print +22.7%) - inflection narrative still rests on one quarter. Genuine positives (new Mumbai plant live Aug-2026, 15% dividend) don't offset the new credit-rating flag. Conviction Medium -&gt; Low-Medium.</w:t>
+            </w:r>
+          </w:p>
+        </w:tc>
+      </w:tr>
     </w:tbl>
     <w:p>
       <w:pPr>
@@ -9464,7 +9495,7 @@
                 <w:b w:val="false"/>
                 <w:bCs w:val="false"/>
               </w:rPr>
-              <w:t xml:space="preserve">four_box 3.0 (threshold) but NOT overridden - conflicting ROCE/ROE/growth data + a veteran forum member's (dd1474) account of 'a very large loss' kept this at neither. Scattered old topic_id candidates found (210/323/8518/29904/76222), none confidently current - not patched.</w:t>
+              <w:t xml:space="preserve">Deep-dive pass 1 (2026-09-17): reconciled the original 'conflicting ROCE/ROE/growth data' caveat using screener.in's own FY-labelled tables (earlier scrape mixed calendar-year and fiscal-year conventions) - both prior 'conflicting' figures turn out correct-but-different windows, not a real data problem. New finding: FY26 was a genuine down year (revenue -17.6%, PAT -25% YoY, breaking a 3-year Coffee-Can streak), followed by a sharp Q1 FY27 rebound (+111% revenue, +151% PAT YoY, highest-ever quarter) - a genuinely lumpy, order-driven business, not a smooth compounder. Confirmed the real moat is patent-protected security/anti-counterfeiting film technology (27 patents, 2 newly granted 2026, 20-yr exclusivity) more than the anti-plastic packaging story originally emphasized. No pledge (FY26 zero-encumbrance filed); dividend rising Rs1-&gt;4/share FY23-25. dd1474's 2022 'large loss, hope investment' community caution remains unresolved. Conviction Medium (unchanged, net wash); thesis_fit stays neither (four_box 3.0, analyst_override - lumpy earnings, valuation full post-rebound).</w:t>
             </w:r>
           </w:p>
         </w:tc>
@@ -12657,7 +12688,7 @@
                 <w:b w:val="false"/>
                 <w:bCs w:val="false"/>
               </w:rPr>
-              <w:t xml:space="preserve">Jaipur uPVC/PVC profiles + windows + modular + rising-margin fluted/soffit panels (brand Polywood); ROCE 19-&gt;26% in 2yr, ~14x, de-levered; Q1FY27 PAT +35% on +10% rev. four_box 2.5 (valuation box yes) but honest return ~2-3x -&gt; neither, conviction Medium. Old dineshssairam RPT flag (2020, mitigated). external-lead.</w:t>
+              <w:t xml:space="preserve">Deep-dive pass 1 (2026-09-18): PAT compounding far faster than revenue (+67% FY26, +35.4% Q1 FY27, vs only +12.6%/+10.0% revenue growth); ROCE up to ~26% (from ~19% FY24). Aluminium Windows &amp; Facade division moved from plan to commercial stage (Rs56cr+ backlog, first named order - Rs4.78cr Godrej Properties facade - guided Rs40-50cr FY27 revenue). Correction: borrowings rose Rs53cr-&gt;Rs76cr in the last year funding a new Rs100cr capex programme - reverses the prior 'steady deleveraging' framing. Maiden dividend initiated (Rs0.70/share, May-2026); promoter holding stabilized ~67.8% for 4 straight quarters, no pledge - the old dineshssairam RPT flag (2020) stays mitigated, not current. Muted ~10-12% revenue growth traced to external causes (FY25 monsoon/GRAP restrictions, FY26 developer site deferrals), not demand weakness - order book at an all-time high (Rs200cr+). Conviction Medium (unchanged); thesis_fit stays neither (four_box 2.5).</w:t>
             </w:r>
           </w:p>
         </w:tc>
@@ -13060,7 +13091,7 @@
                 <w:b w:val="false"/>
                 <w:bCs w:val="false"/>
               </w:rPr>
-              <w:t xml:space="preserve">Global laminated-tube leader merging w/ Indorama's Indovida (Blackstone exit); ROCE 18.1%, Q1FY27 rev +25% but PAT -1.4% (commodity squeeze). Live merger-arb debate on VP thread: swap implies ~Rs339 vs mkt price, one poster called it financial engineering for Blackstone exit not a clean minority deal. four_box 2.5, no exception -&gt; neither. Conviction Medium. Good re-verify candidate post-merger.</w:t>
+              <w:t xml:space="preserve">Deep-dive pass 1 (2026-09-18): Indovida merger materially de-risked - CCI cleared it (May-2026) and minority shareholders already approved via e-voting (Feb-Mar 2026); swap value (~Rs339/share) still implies ~45% upside to CMP (~Rs234), NCLT approval the main remaining gate. New earnings-quality caution: PAT growth stalled for two straight quarters (Q4 FY26 ~flat, Q1 FY27 -1.4% YoY) even as revenue accelerated to +25.3% - commodity cost pass-through lag. Promoter holding drop (51.5%-&gt;26.38%) confirmed as a disclosed, structured Blackstone-to-Indorama stake sale ahead of the merger, not distress - no pledge at any point. four_box reached 3.0 (valuation box upgraded on the persisting arb gap) but treated as merger-arb, not a business-compounding case (analyst override, thesis_fit stays neither). ~18.2x P/E, ROCE ~17.8%/ROE ~15.7% - quality but not cheap for a mature-category mid-cap. Conviction Medium (unchanged).</w:t>
             </w:r>
           </w:p>
         </w:tc>
@@ -13246,7 +13277,7 @@
                 <w:b w:val="false"/>
                 <w:bCs w:val="false"/>
               </w:rPr>
-              <w:t xml:space="preserve">Integrated TOPCon solar cell+module maker; PAT Rs 9cr FY23 -&gt; Rs 1,082cr FY26 on ALMM List-II; Q1FY27 PAT +103%, 35% EBITDA margin (peak). four_box 2.5; un-ignorable-growth exception CONSIDERED but declined - policy-driven cyclical peak into industry-wide capacity build (supply 'adding'). thesis neither, conviction Medium. VP thread 1 day old. external-lead.</w:t>
+              <w:t xml:space="preserve">Deep-dive pass 1 (2026-09-18): deleveraging is real and already executed - debt fell ~83% (Rs2,065cr-&gt;Rs360cr FY25-&gt;FY26) on IPO-proceeds prepayment, ICRA upgraded the rating, interest coverage ~8.2x. Growth multi-sourced: live 2.5 GW module line (since Dec-2025), 9.9 GW order book, new 4.5 GWp TOPCon cell supply deal won by subsidiary Emmvee Energy. Even the bullish sell-side case (Jefferies, Buy, target Rs440) explicitly models margin normalisation to 'high-teens ROCE through-cycle,' corroborating the peak-margin-risk thesis. One immaterial governance blemish (~Rs7.68cr customs penalty, Mar-2026); no pledge, no auditor issue, no SEBI action. four_box unchanged at 2.5 (tam/moat/valuation still weak); thesis_fit stays neither. Conviction Medium (unchanged).</w:t>
             </w:r>
           </w:p>
         </w:tc>
@@ -14875,37 +14906,6 @@
                 <w:bCs/>
                 <w:color w:val="666666"/>
               </w:rPr>
-              <w:t xml:space="preserve">Golkunda Diamond</w:t>
-            </w:r>
-          </w:p>
-        </w:tc>
-        <w:tc>
-          <w:tcPr>
-            <w:tcW w:type="dxa" w:w="6400"/>
-          </w:tcPr>
-          <w:p>
-            <w:r>
-              <w:rPr>
-                <w:b w:val="false"/>
-                <w:bCs w:val="false"/>
-              </w:rPr>
-              <w:t xml:space="preserve">Genuine Q1 FY27 margin/capacity inflection (EBITDA +69%), clean balance sheet, but only 1 quarter vs weak 5yr history; four_box 2.5, no exception - flag for re-check next quarter.</w:t>
-            </w:r>
-          </w:p>
-        </w:tc>
-      </w:tr>
-      <w:tr>
-        <w:tc>
-          <w:tcPr>
-            <w:tcW w:type="dxa" w:w="2600"/>
-          </w:tcPr>
-          <w:p>
-            <w:r>
-              <w:rPr>
-                <w:b/>
-                <w:bCs/>
-                <w:color w:val="666666"/>
-              </w:rPr>
               <w:t xml:space="preserve">Goodyear India Ltd</w:t>
             </w:r>
           </w:p>
@@ -18640,7 +18640,7 @@
                 <w:b w:val="false"/>
                 <w:bCs w:val="false"/>
               </w:rPr>
-              <w:t xml:space="preserve">P/E 32.6x already full; four_box 3.0 but no named inflection -&gt; override to neither. VP thread found (topic 2970), not deep-read.</w:t>
+              <w:t xml:space="preserve">Deep-dive pass 1 (2026-09-17): growth story confirmed genuinely order-book-backed and accelerating - ~Rs2,200cr order book (88% LED), FY26 record revenue Rs4,184cr (+23% YoY, EBITDA +42.8%), Q1 FY27 accelerating further to +32.6% revenue/+41.2% PAT YoY. Clean 4/4-year Coffee-Can track record (FY22-25) sustained through a heavy capex phase. Two caveats: borrowings nearly quadrupled since FY22 (Rs401cr-&gt;Rs973cr) funding the Bangalore LED-capacity facility, and management attributed part of the recent margin beat to 'exceptional tooling profitability,' setting a more modest 12-13% margin target 2 years out. Customer concentration real (top-8 ~85%, Mahindra ~30% + Maruti ~16-26% roughly half the business), though new Tata/Mahindra wins add breadth. Promoter flat 75%, no pledge; DII holding rising (1.3%-&gt;6.7% over 3 years). Conviction Medium (unchanged, net wash - stronger growth offset by rising leverage + margin caveat); thesis_fit stays neither (valuation still full at ~26.6x P/E, growth magnitude doesn't support literal 10x).</w:t>
             </w:r>
           </w:p>
         </w:tc>
@@ -19074,7 +19074,7 @@
                 <w:b w:val="false"/>
                 <w:bCs w:val="false"/>
               </w:rPr>
-              <w:t xml:space="preserve">Strong debt-free growth (FY25 +37.6%, UK/Europe +74.7%) but +89.7% 1yr run-up already priced in; four_box 2.5. VP thread found (topic 1520), not deep-read.</w:t>
+              <w:t xml:space="preserve">Deep-dive pass 1 (2026-09-18): margin expansion now a 2-quarter pattern, not one-off (EBITDA margin 17.9%-&gt;22.8%-&gt;25.3% over last 3 reported quarters). Europe expansion now concrete (two named acquisitions - QliniQ B.V. closed Jun-2026, ABCnow GmbH agreed). Corrected a data-entry conflation: prior 'FY25 revenue growth +37.6%' was actually the Q1 FY27 YoY figure mislabeled - verified actual FY25 growth +20.5%, FY26 +15.6%. Working capital unusually heavy for the sector (inventory days ~270, cash-conversion-cycle ~254 vs ~100-150 for Ajanta/Alembic), funded partly by rising borrowings. four_box unchanged at 2.5 (tam/moat weak, valuation weak after ~90% 1-yr run-up to 28x P/E near 52wk high) - thesis_fit stays neither. Conviction Medium -&gt; Medium-High.</w:t>
             </w:r>
           </w:p>
         </w:tc>
@@ -20996,7 +20996,7 @@
                 <w:b w:val="false"/>
                 <w:bCs w:val="false"/>
               </w:rPr>
-              <w:t xml:space="preserve">Organised electrical-steel lamination leader (~8% share) moving up value chain to 15%+ stator/rotor assemblies; ~24% rev CAGR, ~19% ROCE/ROE, post-merger integration + railway/renewable/power tailwinds. trusted-x @suru27 (high), no floor. No pricing power (fixed EBITDA/tonne), finite TAM, promoter selling ~Rs1400+. four_box 3.0, label declined on unit economics.</w:t>
+              <w:t xml:space="preserve">Deep-dive pass 1 (2026-09-18): the original 'near-debt-free by FY26' framing does not hold - FY26 borrowings actually rose 17.5% YoY to Rs811cr, and management's own updated target now pushes net-debt reduction (to ~Rs300cr) out to FY28 - a genuine, quantifiable guidance miss. ROCE kept declining (18.9%-&gt;14.8%, now a 2-reading confirmed downtrend). TTM PAT growth is actually -1% despite EBITDA-margin expansion, because the effective tax rate stepped up 24%-&gt;30% (ESOP disallowance + hedging accounting). The prior 'promoter selling around Rs1,400+' bear-case point does not show up in shareholding data: promoter holding flat 54.17-54.18% since Dec-2024, pledge fully released since Dec-2024 - resolved as positive, not an active exit signal. Raw-material-cost ratio decline (67%-&gt;61.9%, FY21-25) is hard evidence the HVA thesis is real. four_box valuation box downgraded weak-&gt;no (score 2.5) - thesis_fit stays neither via the mechanical rule. Conviction Medium -&gt; Low-Medium.</w:t>
             </w:r>
           </w:p>
         </w:tc>
@@ -21027,7 +21027,7 @@
                 <w:b w:val="false"/>
                 <w:bCs w:val="false"/>
               </w:rPr>
-              <w:t xml:space="preserve">Real EV two-wheeler belt catalyst, but Q4FY26 EBITDA/PAT declined YoY and a trusted tracker exited over management opacity.</w:t>
+              <w:t xml:space="preserve">Deep-dive pass 1 (2026-09-18): Q1 FY27's headlined 91% PAT jump is substantially a non-operating investment/fair-value gain per two independent sources, not a core-margin recovery - reinforces the Q4 FY26 core weakness (EBITDA -8%, PAT -11% YoY) a trusted tracker already flagged. No independent corroboration found for any specific EV two-wheeler (Ola/Ather) belt order - remains a community-sourced narrative, not a disclosed commercial commitment. Balance sheet genuinely strong (near debt-free 0.09x gearing, CARE A+(Stable)/A1+ reaffirmed Mar-2026, promoter ~62% stable, zero pledge). Persistent management-transparency complaints unresolved; the trusted tracker's opacity-driven exit stands. Conviction Low-Medium (unchanged).</w:t>
             </w:r>
           </w:p>
         </w:tc>
@@ -24375,7 +24375,7 @@
                 <w:b w:val="false"/>
                 <w:bCs w:val="false"/>
               </w:rPr>
-              <w:t xml:space="preserve">Debt-free paint applicator (18yr SKK Japan tie-up), ~24% ROE, 20-25% growth; four_box 3.0 but growth rate doesn't support 10x label -- quality compounder not asymmetric bet. Capital-allocation drag (cash hoarding in MFs)</w:t>
+              <w:t xml:space="preserve">Deep-dive pass 1 (2026-09-17): primary-document pass (first-ever deep dive) confirms the thread's cash-hoarding narrative with hard numbers - net cash ~Rs9.7cr sitting in MFs/FDs, zero debt, clean 3/3-checkable-fiscal-year Coffee-Can pass (FY23-25 each cleared &gt;=10% revenue growth and &gt;=15% ROCE). OPM expanded structurally 9%(FY22)-&gt;22%(FY26) as scale absorbed largely fixed application-business costs - a genuine margin story. At ~14.5x trailing P/E the market doesn't look like it's pricing in this quality (reverse-P/E implies only ~10-12% forward growth needed). Growth decelerating off a larger base (+48%-&gt;17%-&gt;15%-&gt;14% half-yearly YoY over last 4 periods); promoter flat 63.09% for 2+ years, no pledge. four_box 3.0 but growth rate doesn't support a 10x label - quality compounder not an asymmetric bet; capital-allocation drag (cash hoarding). Conviction Medium (unchanged).</w:t>
             </w:r>
           </w:p>
         </w:tc>
@@ -24468,7 +24468,7 @@
                 <w:b w:val="false"/>
                 <w:bCs w:val="false"/>
               </w:rPr>
-              <w:t xml:space="preserve">Real T&amp;D-capex tailwind, four_box 3.0, but headline ROCE (~47.8%)/growth (~65.7%) figures look anomalous/unverified; capped Medium. Pre-existing 246-post VP thread (topic 2952), too large to deep-read this pass.</w:t>
+              <w:t xml:space="preserve">Deep-dive pass 1 (2026-09-18): record Rs9,217cr order book (Jun-26, ~1.65x FY26 revenue) incl. Aug-26 Rs1,305cr domestic 765kV + North America export win. Management raised FY27 guidance mid-year (export inflow Rs650cr-&gt;Rs1,500cr; total inflow to Rs7,500cr) - a credibility positive. ROCE trajectory (9%-&gt;24%, FY20-26) and FY24's +65.8% growth figure independently confirmed as genuine, not aggregator artifacts (resolves the prior 'anomalous/unverified' caveat). New caution: gross debt rose Rs579cr(FY24)-&gt;Rs931cr(FY26), FCF conversion stays thin (~1% of EBITDA); promoter holding fell 66.50%-&gt;61.48% in one month (Jun-&gt;Jul-26) concurrent with an FII jump - likely a block deal, unconfirmed, watch next quarter. Conviction Medium -&gt; Medium-High; thesis_fit stays neither (four_box 3.0, analyst_override retained - capital-intensive/leveraged EPC economics don't fit a 10x/100x label despite strong fundamentals).</w:t>
             </w:r>
           </w:p>
         </w:tc>
@@ -26593,37 +26593,6 @@
                 <w:bCs/>
                 <w:color w:val="666666"/>
               </w:rPr>
-              <w:t xml:space="preserve">Univastu India</w:t>
-            </w:r>
-          </w:p>
-        </w:tc>
-        <w:tc>
-          <w:tcPr>
-            <w:tcW w:type="dxa" w:w="6400"/>
-          </w:tcPr>
-          <w:p>
-            <w:r>
-              <w:rPr>
-                <w:b w:val="false"/>
-                <w:bCs w:val="false"/>
-              </w:rPr>
-              <w:t xml:space="preserve">EPC/construction, cheap (P/E ~12x, 27% growth) but debtor days doubled 58-&gt;121; four_box 2.5, no exception -&gt; neither.</w:t>
-            </w:r>
-          </w:p>
-        </w:tc>
-      </w:tr>
-      <w:tr>
-        <w:tc>
-          <w:tcPr>
-            <w:tcW w:type="dxa" w:w="2600"/>
-          </w:tcPr>
-          <w:p>
-            <w:r>
-              <w:rPr>
-                <w:b/>
-                <w:bCs/>
-                <w:color w:val="666666"/>
-              </w:rPr>
               <w:t xml:space="preserve">Universal Cables</w:t>
             </w:r>
           </w:p>
@@ -28127,6 +28096,37 @@
                 <w:bCs w:val="false"/>
               </w:rPr>
               <w:t xml:space="preserve">Global BOPET/BOPP films maker at a cyclical trough (ROE &lt;1%). Dominant issue is governance: Dubai partner AGP tendering for Polyplex Thailand minority below independent fair value, minority SEBI SCORES complaints, Nov-2026 AGP-Saraf put/call. Cycle-turn + First Water Fund accumulation are the only bull tells; no trusted-user conviction.</w:t>
+            </w:r>
+          </w:p>
+        </w:tc>
+      </w:tr>
+      <w:tr>
+        <w:tc>
+          <w:tcPr>
+            <w:tcW w:type="dxa" w:w="2600"/>
+          </w:tcPr>
+          <w:p>
+            <w:r>
+              <w:rPr>
+                <w:b/>
+                <w:bCs/>
+                <w:color w:val="666666"/>
+              </w:rPr>
+              <w:t xml:space="preserve">Devson Catalyst Ltd</w:t>
+            </w:r>
+          </w:p>
+        </w:tc>
+        <w:tc>
+          <w:tcPr>
+            <w:tcW w:type="dxa" w:w="6400"/>
+          </w:tcPr>
+          <w:p>
+            <w:r>
+              <w:rPr>
+                <w:b w:val="false"/>
+                <w:bCs w:val="false"/>
+              </w:rPr>
+              <w:t xml:space="preserve">Deep-dive pass 1 (2026-09-18) downgraded thesis_fit 10x-in-2-3-years -&gt; neither (four_box 2.0): revenue growth decelerated sharply 3 straight years (+30% -&gt; +23% -&gt; +5.6%), working-capital days elongated 70-&gt;128 (debtor days 87-&gt;110) in FY26 independent of growth. New evidenced win (Ammonia Decomposition Catalyst at NMDC + first Tata Steel order Sept-2026) is a real R&amp;D proof point but unquantified. Customer concentration (top-10 = 76%) and single-country export concentration (Kuwait ~46% of exports) now explicit. IPO-funded capacity doubling (6,205-&gt;11,293 MTPA) financed, not aspirational; ~Rs443cr mkt cap, ~36x P/E. Conviction stays Low.</w:t>
             </w:r>
           </w:p>
         </w:tc>

</xml_diff>

<commit_message>
vpscreen-rerank: tiered ranking refresh: Solex Energy moved tierC->screenedOut (thesis downgraded to neither), rationale/dimensions refreshed for TIL/Kaveri Seeds/GRSE/Capacite/KP Energy/GNG/Omnitech/Raghav Productivity/Sacheerome; Confluence-100 + Rs1L allocation rebuilt, Powerica symbol verified
Co-Authored-By: Claude Sonnet 5 <noreply@anthropic.com>
</commit_message>
<xml_diff>
--- a/projects/valuepickr-open-screen/docs/00_SCREEN_RANKING.docx
+++ b/projects/valuepickr-open-screen/docs/00_SCREEN_RANKING.docx
@@ -1143,7 +1143,7 @@
           <w:sz w:val="20"/>
           <w:szCs w:val="20"/>
         </w:rPr>
-        <w:t xml:space="preserve">  —  WC deterioration confirmed multi-yr</w:t>
+        <w:t xml:space="preserve">  —  FY26 growth beat guidance, but FCF caution now confirmed</w:t>
       </w:r>
       <w:r>
         <w:rPr>
@@ -1152,7 +1152,7 @@
         </w:rPr>
         <w:br/>
         <w:t xml:space="preserve">
-WC deterioration confirmed multi-yr; CARE BBB upgrade; KKOC governance debate went public, unresolved [conviction_score 46.0]</w:t>
+FY26 revenue +34%/PAT +91% beat management's own 20-25% guidance, but FY26 operating cash flow swung to -Rs215cr (vs +Rs25cr FY25) on inventory+receivables tied to new 30-45 day distributor credit -- confirms the prior FCF caution rather than resolving it. 80-120bps of margin gain flagged as cyclical (pre-buying ahead of a memory-chip price spike), expected to partially unwind. New KKOC related-party brand-value dispute publicly refuted by the company but unresolved. Net debt down Rs466cr -&gt; Rs300cr since Dec-2025. Conviction Medium -&gt; Low-Medium [conviction_score 40.46].</w:t>
       </w:r>
     </w:p>
     <w:p>
@@ -4495,7 +4495,7 @@
           <w:sz w:val="24"/>
           <w:szCs w:val="24"/>
         </w:rPr>
-        <w:t xml:space="preserve">129. Solex Energy Ltd</w:t>
+        <w:t xml:space="preserve">129. Sonu Infratech Ltd</w:t>
       </w:r>
       <w:r>
         <w:rPr>
@@ -4528,7 +4528,7 @@
           <w:sz w:val="24"/>
           <w:szCs w:val="24"/>
         </w:rPr>
-        <w:t xml:space="preserve">130. Sonu Infratech Ltd</w:t>
+        <w:t xml:space="preserve">130. Sri Lotus Developers</w:t>
       </w:r>
       <w:r>
         <w:rPr>
@@ -4561,7 +4561,7 @@
           <w:sz w:val="24"/>
           <w:szCs w:val="24"/>
         </w:rPr>
-        <w:t xml:space="preserve">131. Sri Lotus Developers</w:t>
+        <w:t xml:space="preserve">131. Susan Electricals India Ltd</w:t>
       </w:r>
       <w:r>
         <w:rPr>
@@ -4594,7 +4594,7 @@
           <w:sz w:val="24"/>
           <w:szCs w:val="24"/>
         </w:rPr>
-        <w:t xml:space="preserve">132. Susan Electricals India Ltd</w:t>
+        <w:t xml:space="preserve">132. Swastika Castal Ltd</w:t>
       </w:r>
       <w:r>
         <w:rPr>
@@ -4627,7 +4627,7 @@
           <w:sz w:val="24"/>
           <w:szCs w:val="24"/>
         </w:rPr>
-        <w:t xml:space="preserve">133. Swastika Castal Ltd</w:t>
+        <w:t xml:space="preserve">133. Transrail Lighting Ltd</w:t>
       </w:r>
       <w:r>
         <w:rPr>
@@ -4660,7 +4660,7 @@
           <w:sz w:val="24"/>
           <w:szCs w:val="24"/>
         </w:rPr>
-        <w:t xml:space="preserve">134. Transrail Lighting Ltd</w:t>
+        <w:t xml:space="preserve">134. TruAlt Bioenergy</w:t>
       </w:r>
       <w:r>
         <w:rPr>
@@ -4693,7 +4693,7 @@
           <w:sz w:val="24"/>
           <w:szCs w:val="24"/>
         </w:rPr>
-        <w:t xml:space="preserve">135. TruAlt Bioenergy</w:t>
+        <w:t xml:space="preserve">135. Ugro Capital</w:t>
       </w:r>
       <w:r>
         <w:rPr>
@@ -4726,7 +4726,7 @@
           <w:sz w:val="24"/>
           <w:szCs w:val="24"/>
         </w:rPr>
-        <w:t xml:space="preserve">136. Ugro Capital</w:t>
+        <w:t xml:space="preserve">136. Unihealth Hospitals Ltd</w:t>
       </w:r>
       <w:r>
         <w:rPr>
@@ -4759,7 +4759,7 @@
           <w:sz w:val="24"/>
           <w:szCs w:val="24"/>
         </w:rPr>
-        <w:t xml:space="preserve">137. Unihealth Hospitals Ltd</w:t>
+        <w:t xml:space="preserve">137. Vikram Solar- One of the oldest Solar module manufacturer</w:t>
       </w:r>
       <w:r>
         <w:rPr>
@@ -4792,7 +4792,7 @@
           <w:sz w:val="24"/>
           <w:szCs w:val="24"/>
         </w:rPr>
-        <w:t xml:space="preserve">138. Vikram Solar- One of the oldest Solar module manufacturer</w:t>
+        <w:t xml:space="preserve">138. Walchandnagar Industries | Return of a Golden Era</w:t>
       </w:r>
       <w:r>
         <w:rPr>
@@ -4825,40 +4825,7 @@
           <w:sz w:val="24"/>
           <w:szCs w:val="24"/>
         </w:rPr>
-        <w:t xml:space="preserve">139. Walchandnagar Industries | Return of a Golden Era</w:t>
-      </w:r>
-      <w:r>
-        <w:rPr>
-          <w:i/>
-          <w:iCs/>
-          <w:color w:val="666666"/>
-          <w:sz w:val="20"/>
-          <w:szCs w:val="20"/>
-        </w:rPr>
-        <w:t xml:space="preserve">  —  undefined</w:t>
-      </w:r>
-      <w:r>
-        <w:rPr>
-          <w:sz w:val="20"/>
-          <w:szCs w:val="20"/>
-        </w:rPr>
-        <w:br/>
-        <w:t xml:space="preserve">
-undefined</w:t>
-      </w:r>
-    </w:p>
-    <w:p>
-      <w:pPr>
-        <w:spacing w:after="160"/>
-      </w:pPr>
-      <w:r>
-        <w:rPr>
-          <w:b/>
-          <w:bCs/>
-          <w:sz w:val="24"/>
-          <w:szCs w:val="24"/>
-        </w:rPr>
-        <w:t xml:space="preserve">140. Zaggle_A platform to address pain points for enterprises</w:t>
+        <w:t xml:space="preserve">139. Zaggle_A platform to address pain points for enterprises</w:t>
       </w:r>
       <w:r>
         <w:rPr>
@@ -14548,7 +14515,7 @@
                 <w:b w:val="false"/>
                 <w:bCs w:val="false"/>
               </w:rPr>
-              <w:t xml:space="preserve">43% ROCE, 31.8% ROE, debt-free defence PSU shipyard — best fundamentals in batch but already crossed into large-cap.</w:t>
+              <w:t xml:space="preserve">43% ROCE, 31.8% ROE, debt-free defence PSU shipyard, Navratna status (Jun-2026) -- best fundamentals in batch but already crossed into large-cap. FY26 revenue +38%, PAT +42%; Q1 FY27 continued +39%/+44% YoY, growth steady not decelerating. Next-Gen Corvette award (~Rs33,000-36,000cr) CCS-approved, signing expected Q2 FY27. Order book fell to a decade-low Rs13,596cr on fast execution (not weak demand). Already full valuation (34.5x P/E, 10.5x P/B). Conviction Medium-High -&gt; High.</w:t>
             </w:r>
           </w:p>
         </w:tc>
@@ -17648,7 +17615,7 @@
                 <w:b w:val="false"/>
                 <w:bCs w:val="false"/>
               </w:rPr>
-              <w:t xml:space="preserve">Good ROE/ROCE, debt-free, but structurally weather-driven low growth (6.18% 5yr)</w:t>
+              <w:t xml:space="preserve">Good ROE/ROCE, debt-free, revenue mix has structurally diversified (cotton 70%+ -&gt; ~25-28% of revenue by FY25), but Q1 FY27 shows non-cotton segments (maize -39% volume) are just as monsoon-exposed -- the mix changed, the weather dependency didn't. 4-yr Coffee-Can check clears only 2 of 4 years on both growth+ROCE bars. Working-capital days deteriorated sharply 151 -&gt; 275 (FY26), a new quality caution. Conviction Medium-High -&gt; Medium; prior score was an under-researched categorical anchor, now corrected.</w:t>
             </w:r>
           </w:p>
         </w:tc>
@@ -20624,7 +20591,7 @@
                 <w:b w:val="false"/>
                 <w:bCs w:val="false"/>
               </w:rPr>
-              <w:t xml:space="preserve">Resolved as Omnitech Engineering Ltd (NSE:OMNI) with a caveat - plausible not certain match vs a dormant, unrelated Omnitech Infosolutions. 92% revenue growth but ~84x P/E already stretched; four_box 2.5.</w:t>
+              <w:t xml:space="preserve">Order book surged ~970% YoY to ~Rs3,033cr (May-26), heavily energy-concentrated (73.7%), backing a new ~Rs250cr FY27/28 capex to lift machine-hour capacity ~60%. But Q1 FY27 (first full quarter listed) showed EBITDA growing only ~1% QoQ despite ~12% QoQ revenue growth -- the guided operating leverage hasn't shown up yet, and debtor days (~153-172) remain a live caution. Leverage genuinely improved post-IPO (D/E ~1.7x -&gt; ~0.7x) but valuation is still rich (~66-68x trailing P/E, ~10x book) with no margin of safety. Promoter pledge/RPT specifics unconfirmed this pass (source WebFetch failed).</w:t>
             </w:r>
           </w:p>
         </w:tc>
@@ -21833,7 +21800,7 @@
                 <w:b w:val="false"/>
                 <w:bCs w:val="false"/>
               </w:rPr>
-              <w:t xml:space="preserve">Entity confirmed as Raghav Productivity Enhancers Ltd (RPEL). Strong ROCE/ROE, only ~12% growth; four_box 2.5, default neither.</w:t>
+              <w:t xml:space="preserve">Entity confirmed as Raghav Productivity Enhancers Ltd (RPEL). Growth has genuinely re-accelerated (FY26 revenue +28.8%/PAT +48.2%; Q1 FY27 revenue +48.7%/PAT +67.6%, a record quarter), backed by an organic +120,000 MTPA expansion plus a new Rs100cr JV with TRL Krosaki (first multi-location move, unproven execution). But valuation has become extreme (~127x P/E, ~32x P/B) -- even a 40%-CAGR bull case at a generous 30x exit implies a price below CMP. Working capital elongated to ~255 days; rising RPT / preferential-issuance history flagged from a stale (2021) source, not reverified. Promoter holding clean (~62.9% flat, zero pledge).</w:t>
             </w:r>
           </w:p>
         </w:tc>
@@ -22949,7 +22916,7 @@
                 <w:b w:val="false"/>
                 <w:bCs w:val="false"/>
               </w:rPr>
-              <w:t xml:space="preserve">B2B fragrance &amp; flavour, brief-to-formulation lock-in; ROCE 36-39%, debt-free, ~24% rev CAGR, OPM 13-&gt;24%, Mukul Agarwal AIF holder; small F&amp;F TAM, 4x capacity ahead of conservative guide, stock ~3x issue. VP thread 9 posts constructive-skeptical, no trusted users. four_box 2.5 -&gt; neither, but Medium on genuine quality.</w:t>
+              <w:t xml:space="preserve">B2B fragrance &amp; flavour, brief-to-formulation lock-in. Execution has genuinely proven out (FY26 revenue +41%, EBITDA margin 26.02%, PAT +78%, ROCE 35.7% sustained, 3 of 4 years clear the Coffee-Can bar), and zero promoter pledge / 71.54% holding confirmed via Reg 31(4) filing. But the stock re-rated a second leg on it (P/E ~26x -&gt; ~41x, price ~5x issue price) -- entry price is now the dominant risk, not the business. FII+DII holding nearly halved (~14.3% -&gt; ~6.5%) since listing, reason unconfirmed. four_box valuation box weakened further; thesis_fit stays neither.</w:t>
             </w:r>
           </w:p>
         </w:tc>
@@ -25553,7 +25520,7 @@
                 <w:b w:val="false"/>
                 <w:bCs w:val="false"/>
               </w:rPr>
-              <w:t xml:space="preserve">Early-stage turnaround, real operating-leverage/Gainwell-synergy catalyst, but high debt and negative consolidated PAT</w:t>
+              <w:t xml:space="preserve">Early-stage turnaround, but FY26 consolidated PAT loss actually widened to -Rs30.86cr (from +Rs2.9cr FY25) -- the turnaround had not yet shown up. Headline Q1 FY27 +66-86% growth is substantially inorganic (first consolidation of the May-2026 Tulip Compression acquisition, a related-party-adjacent purchase from promoter-affiliate Gainwell Commosales); standalone organic growth was a more modest +25%. Real order-book evidence (~Rs110cr defence, Rs66.75cr CONCOR, Rs274cr FY27 pipeline) and legacy tax disputes resolved via SoD scheme. four_box valuation box turned no (2.5 -&gt; 2.0).</w:t>
             </w:r>
           </w:p>
         </w:tc>
@@ -28127,6 +28094,37 @@
                 <w:bCs w:val="false"/>
               </w:rPr>
               <w:t xml:space="preserve">Deep-dive pass 1 (2026-09-18) downgraded thesis_fit 10x-in-2-3-years -&gt; neither (four_box 2.0): revenue growth decelerated sharply 3 straight years (+30% -&gt; +23% -&gt; +5.6%), working-capital days elongated 70-&gt;128 (debtor days 87-&gt;110) in FY26 independent of growth. New evidenced win (Ammonia Decomposition Catalyst at NMDC + first Tata Steel order Sept-2026) is a real R&amp;D proof point but unquantified. Customer concentration (top-10 = 76%) and single-country export concentration (Kuwait ~46% of exports) now explicit. IPO-funded capacity doubling (6,205-&gt;11,293 MTPA) financed, not aspirational; ~Rs443cr mkt cap, ~36x P/E. Conviction stays Low.</w:t>
+            </w:r>
+          </w:p>
+        </w:tc>
+      </w:tr>
+      <w:tr>
+        <w:tc>
+          <w:tcPr>
+            <w:tcW w:type="dxa" w:w="2600"/>
+          </w:tcPr>
+          <w:p>
+            <w:r>
+              <w:rPr>
+                <w:b/>
+                <w:bCs/>
+                <w:color w:val="666666"/>
+              </w:rPr>
+              <w:t xml:space="preserve">Solex Energy Ltd</w:t>
+            </w:r>
+          </w:p>
+        </w:tc>
+        <w:tc>
+          <w:tcPr>
+            <w:tcW w:type="dxa" w:w="6400"/>
+          </w:tcPr>
+          <w:p>
+            <w:r>
+              <w:rPr>
+                <w:b w:val="false"/>
+                <w:bCs w:val="false"/>
+              </w:rPr>
+              <w:t xml:space="preserve">Guidance credibility broken: FY26 revenue (Rs1,621cr) missed both original (Rs2,000cr+) and revised H1 guidance (~Rs1,850cr); Q1 FY27 PAT -66.6% YoY on new-capacity depreciation outpacing revenue and ALMM delays. thesis_fit downgraded 10x-in-2-3-years -&gt; neither (2026-09-22 deep-dive). Price down ~64.5% from 52wk high. four_box 3.0 -&gt; 2.5.</w:t>
             </w:r>
           </w:p>
         </w:tc>

</xml_diff>

<commit_message>
vpscreen-rerank: vpscreen-rerank 2026-10-03: 5 newly-researched stocks placed (GV Elec→HIGH CAUTION, Gandhar/AGI→tierC, Gokaldas/HDFC AMC→tierB, Avalon→screenedOut); Confluence-100 rebuilt with 6-hold allocation; tactical1m W41 inaugural cohort launched
Co-Authored-By: Claude Sonnet 5 <noreply@anthropic.com>
</commit_message>
<xml_diff>
--- a/projects/valuepickr-open-screen/docs/00_SCREEN_RANKING.docx
+++ b/projects/valuepickr-open-screen/docs/00_SCREEN_RANKING.docx
@@ -2510,6 +2510,72 @@
     </w:p>
     <w:p>
       <w:pPr>
+        <w:spacing w:after="160"/>
+      </w:pPr>
+      <w:r>
+        <w:rPr>
+          <w:b/>
+          <w:bCs/>
+          <w:sz w:val="24"/>
+          <w:szCs w:val="24"/>
+        </w:rPr>
+        <w:t xml:space="preserve">70. Gokaldas Exports Ltd</w:t>
+      </w:r>
+      <w:r>
+        <w:rPr>
+          <w:i/>
+          <w:iCs/>
+          <w:color w:val="666666"/>
+          <w:sz w:val="20"/>
+          <w:szCs w:val="20"/>
+        </w:rPr>
+        <w:t xml:space="preserve">  —  Apparel exporter riding tariff tailwinds; AGOA Dec 2026 extension risk</w:t>
+      </w:r>
+      <w:r>
+        <w:rPr>
+          <w:sz w:val="20"/>
+          <w:szCs w:val="20"/>
+        </w:rPr>
+        <w:br/>
+        <w:t xml:space="preserve">
+Tariff tailwinds (U.S. Section 301, UK FTA) removed structural disadvantage; Q1 FY27 revenue +21% YoY (India +16%, Africa +45%). Guidance 15-20% FY27 growth; AGOA extension risk (expires Dec 2026) and wage inflation (Haryana +35%) are the watch. Capacity expansion (2,000-3,000 new machines, INR175-200 cr steady-state revenue add FY29) and BTPL fabric merger (target Q3 FY27) both live but execution-dependent. Valuation 32.5x P/E premium to peers justified only if tariffs + AGOA hold; downside if extension fails.</w:t>
+      </w:r>
+    </w:p>
+    <w:p>
+      <w:pPr>
+        <w:spacing w:after="160"/>
+      </w:pPr>
+      <w:r>
+        <w:rPr>
+          <w:b/>
+          <w:bCs/>
+          <w:sz w:val="24"/>
+          <w:szCs w:val="24"/>
+        </w:rPr>
+        <w:t xml:space="preserve">71. HDFC Asset Management Company Ltd</w:t>
+      </w:r>
+      <w:r>
+        <w:rPr>
+          <w:i/>
+          <w:iCs/>
+          <w:color w:val="666666"/>
+          <w:sz w:val="20"/>
+          <w:szCs w:val="20"/>
+        </w:rPr>
+        <w:t xml:space="preserve">  —  Alternatives growth (private credit, VC/PE) + SIP momentum; jury out on downturn durability</w:t>
+      </w:r>
+      <w:r>
+        <w:rPr>
+          <w:sz w:val="20"/>
+          <w:szCs w:val="20"/>
+        </w:rPr>
+        <w:br/>
+        <w:t xml:space="preserve">
+Alternatives AUM at Rs 148 bn (+2.5x YoY, up from Rs 60 bn), private credit fund closed in Q1, 2nd VC/PE fund seeded by $50M global investor. SIF platform launched (H-SIF equity ex top-100 long-short fund near-term launch). Q1 FY27 revenue +14% YoY, PAT +12% YoY; 28% unique investor penetration, SIP flows +20% YoY. Jury still out on new-cohort durability over extended downturn, but alternatives scale path + SIP momentum are structural. Valuation 42.5x P/E on 12% growth is 3.5x multiple-to-growth, justified only if alternatives reach 5-10% AUM by FY29; peer AMCs typically 20-30x.</w:t>
+      </w:r>
+    </w:p>
+    <w:p>
+      <w:pPr>
         <w:pStyle w:val="Heading1"/>
         <w:spacing w:after="140" w:before="320"/>
       </w:pPr>
@@ -2548,7 +2614,7 @@
           <w:sz w:val="24"/>
           <w:szCs w:val="24"/>
         </w:rPr>
-        <w:t xml:space="preserve">70. 20 Microns : micronized to nano-sized minerals</w:t>
+        <w:t xml:space="preserve">72. 20 Microns : micronized to nano-sized minerals</w:t>
       </w:r>
       <w:r>
         <w:rPr>
@@ -2581,7 +2647,7 @@
           <w:sz w:val="24"/>
           <w:szCs w:val="24"/>
         </w:rPr>
-        <w:t xml:space="preserve">71. ASM Technologies</w:t>
+        <w:t xml:space="preserve">73. ASM Technologies</w:t>
       </w:r>
       <w:r>
         <w:rPr>
@@ -2614,7 +2680,7 @@
           <w:sz w:val="24"/>
           <w:szCs w:val="24"/>
         </w:rPr>
-        <w:t xml:space="preserve">72. Aarti Surfactants Ltd</w:t>
+        <w:t xml:space="preserve">74. Aarti Surfactants Ltd</w:t>
       </w:r>
       <w:r>
         <w:rPr>
@@ -2647,7 +2713,7 @@
           <w:sz w:val="24"/>
           <w:szCs w:val="24"/>
         </w:rPr>
-        <w:t xml:space="preserve">73. Accent Microcell Limited</w:t>
+        <w:t xml:space="preserve">75. Accent Microcell Limited</w:t>
       </w:r>
       <w:r>
         <w:rPr>
@@ -2680,7 +2746,7 @@
           <w:sz w:val="24"/>
           <w:szCs w:val="24"/>
         </w:rPr>
-        <w:t xml:space="preserve">74. Alufluoride Limited-conversion of waste into wealth</w:t>
+        <w:t xml:space="preserve">76. Alufluoride Limited-conversion of waste into wealth</w:t>
       </w:r>
       <w:r>
         <w:rPr>
@@ -2713,7 +2779,7 @@
           <w:sz w:val="24"/>
           <w:szCs w:val="24"/>
         </w:rPr>
-        <w:t xml:space="preserve">75. Archit Nuwood Industries</w:t>
+        <w:t xml:space="preserve">77. Archit Nuwood Industries</w:t>
       </w:r>
       <w:r>
         <w:rPr>
@@ -2746,7 +2812,7 @@
           <w:sz w:val="24"/>
           <w:szCs w:val="24"/>
         </w:rPr>
-        <w:t xml:space="preserve">76. Axiscades Engineering</w:t>
+        <w:t xml:space="preserve">78. Axiscades Engineering</w:t>
       </w:r>
       <w:r>
         <w:rPr>
@@ -2779,7 +2845,7 @@
           <w:sz w:val="24"/>
           <w:szCs w:val="24"/>
         </w:rPr>
-        <w:t xml:space="preserve">77. Bhadora Industries Ltd</w:t>
+        <w:t xml:space="preserve">79. Bhadora Industries Ltd</w:t>
       </w:r>
       <w:r>
         <w:rPr>
@@ -2812,7 +2878,7 @@
           <w:sz w:val="24"/>
           <w:szCs w:val="24"/>
         </w:rPr>
-        <w:t xml:space="preserve">78. Bondada Engineering Ltd</w:t>
+        <w:t xml:space="preserve">80. Bondada Engineering Ltd</w:t>
       </w:r>
       <w:r>
         <w:rPr>
@@ -2845,7 +2911,7 @@
           <w:sz w:val="24"/>
           <w:szCs w:val="24"/>
         </w:rPr>
-        <w:t xml:space="preserve">79. Borana Weaves</w:t>
+        <w:t xml:space="preserve">81. Borana Weaves</w:t>
       </w:r>
       <w:r>
         <w:rPr>
@@ -2878,7 +2944,7 @@
           <w:sz w:val="24"/>
           <w:szCs w:val="24"/>
         </w:rPr>
-        <w:t xml:space="preserve">80. COSMIC CRF LIMITED</w:t>
+        <w:t xml:space="preserve">82. COSMIC CRF LIMITED</w:t>
       </w:r>
       <w:r>
         <w:rPr>
@@ -2911,7 +2977,7 @@
           <w:sz w:val="24"/>
           <w:szCs w:val="24"/>
         </w:rPr>
-        <w:t xml:space="preserve">81. CSL Finance Limited</w:t>
+        <w:t xml:space="preserve">83. CSL Finance Limited</w:t>
       </w:r>
       <w:r>
         <w:rPr>
@@ -2944,7 +3010,7 @@
           <w:sz w:val="24"/>
           <w:szCs w:val="24"/>
         </w:rPr>
-        <w:t xml:space="preserve">82. Capacit'e Infraprojects</w:t>
+        <w:t xml:space="preserve">84. Capacit'e Infraprojects</w:t>
       </w:r>
       <w:r>
         <w:rPr>
@@ -2977,7 +3043,7 @@
           <w:sz w:val="24"/>
           <w:szCs w:val="24"/>
         </w:rPr>
-        <w:t xml:space="preserve">83. Chamunda Electricals Ltd</w:t>
+        <w:t xml:space="preserve">85. Chamunda Electricals Ltd</w:t>
       </w:r>
       <w:r>
         <w:rPr>
@@ -3010,7 +3076,7 @@
           <w:sz w:val="24"/>
           <w:szCs w:val="24"/>
         </w:rPr>
-        <w:t xml:space="preserve">84. Desco Infratech Ltd</w:t>
+        <w:t xml:space="preserve">86. Desco Infratech Ltd</w:t>
       </w:r>
       <w:r>
         <w:rPr>
@@ -3043,7 +3109,7 @@
           <w:sz w:val="24"/>
           <w:szCs w:val="24"/>
         </w:rPr>
-        <w:t xml:space="preserve">85. Divgi TorqTransfer Systems Ltd</w:t>
+        <w:t xml:space="preserve">87. Divgi TorqTransfer Systems Ltd</w:t>
       </w:r>
       <w:r>
         <w:rPr>
@@ -3076,7 +3142,7 @@
           <w:sz w:val="24"/>
           <w:szCs w:val="24"/>
         </w:rPr>
-        <w:t xml:space="preserve">86. ESDS Software Solution Ltd</w:t>
+        <w:t xml:space="preserve">88. ESDS Software Solution Ltd</w:t>
       </w:r>
       <w:r>
         <w:rPr>
@@ -3109,7 +3175,7 @@
           <w:sz w:val="24"/>
           <w:szCs w:val="24"/>
         </w:rPr>
-        <w:t xml:space="preserve">87. Earkart Ltd</w:t>
+        <w:t xml:space="preserve">89. Earkart Ltd</w:t>
       </w:r>
       <w:r>
         <w:rPr>
@@ -3142,7 +3208,7 @@
           <w:sz w:val="24"/>
           <w:szCs w:val="24"/>
         </w:rPr>
-        <w:t xml:space="preserve">88. Eldeco Housing Ltd</w:t>
+        <w:t xml:space="preserve">90. Eldeco Housing Ltd</w:t>
       </w:r>
       <w:r>
         <w:rPr>
@@ -3175,7 +3241,7 @@
           <w:sz w:val="24"/>
           <w:szCs w:val="24"/>
         </w:rPr>
-        <w:t xml:space="preserve">89. Electronics Mart India Limited- EMIL</w:t>
+        <w:t xml:space="preserve">91. Electronics Mart India Limited- EMIL</w:t>
       </w:r>
       <w:r>
         <w:rPr>
@@ -3208,7 +3274,7 @@
           <w:sz w:val="24"/>
           <w:szCs w:val="24"/>
         </w:rPr>
-        <w:t xml:space="preserve">90. Emerald Finance</w:t>
+        <w:t xml:space="preserve">92. Emerald Finance</w:t>
       </w:r>
       <w:r>
         <w:rPr>
@@ -3241,7 +3307,7 @@
           <w:sz w:val="24"/>
           <w:szCs w:val="24"/>
         </w:rPr>
-        <w:t xml:space="preserve">91. Eppelton (EEPL)</w:t>
+        <w:t xml:space="preserve">93. Eppelton (EEPL)</w:t>
       </w:r>
       <w:r>
         <w:rPr>
@@ -3274,7 +3340,7 @@
           <w:sz w:val="24"/>
           <w:szCs w:val="24"/>
         </w:rPr>
-        <w:t xml:space="preserve">92. Freshara Agro Exports Ltd</w:t>
+        <w:t xml:space="preserve">94. Freshara Agro Exports Ltd</w:t>
       </w:r>
       <w:r>
         <w:rPr>
@@ -3307,7 +3373,7 @@
           <w:sz w:val="24"/>
           <w:szCs w:val="24"/>
         </w:rPr>
-        <w:t xml:space="preserve">93. GHCL Textiles Ltd</w:t>
+        <w:t xml:space="preserve">95. GHCL Textiles Ltd</w:t>
       </w:r>
       <w:r>
         <w:rPr>
@@ -3340,7 +3406,7 @@
           <w:sz w:val="24"/>
           <w:szCs w:val="24"/>
         </w:rPr>
-        <w:t xml:space="preserve">94. GV Electricals Ltd</w:t>
+        <w:t xml:space="preserve">96. Glen Industries Ltd</w:t>
       </w:r>
       <w:r>
         <w:rPr>
@@ -3373,7 +3439,7 @@
           <w:sz w:val="24"/>
           <w:szCs w:val="24"/>
         </w:rPr>
-        <w:t xml:space="preserve">95. Glen Industries Ltd</w:t>
+        <w:t xml:space="preserve">97. Hind Rectifiers Ltd (HIRECT)</w:t>
       </w:r>
       <w:r>
         <w:rPr>
@@ -3406,7 +3472,7 @@
           <w:sz w:val="24"/>
           <w:szCs w:val="24"/>
         </w:rPr>
-        <w:t xml:space="preserve">96. Hind Rectifiers Ltd (HIRECT)</w:t>
+        <w:t xml:space="preserve">98. I G Petrochemicals Ltd</w:t>
       </w:r>
       <w:r>
         <w:rPr>
@@ -3439,7 +3505,7 @@
           <w:sz w:val="24"/>
           <w:szCs w:val="24"/>
         </w:rPr>
-        <w:t xml:space="preserve">97. I G Petrochemicals Ltd</w:t>
+        <w:t xml:space="preserve">99. IZMO- bet on new technologies in Auto retail &amp; defence</w:t>
       </w:r>
       <w:r>
         <w:rPr>
@@ -3472,7 +3538,7 @@
           <w:sz w:val="24"/>
           <w:szCs w:val="24"/>
         </w:rPr>
-        <w:t xml:space="preserve">98. IZMO- bet on new technologies in Auto retail &amp; defence</w:t>
+        <w:t xml:space="preserve">100. Ideaforge technologies</w:t>
       </w:r>
       <w:r>
         <w:rPr>
@@ -3505,7 +3571,7 @@
           <w:sz w:val="24"/>
           <w:szCs w:val="24"/>
         </w:rPr>
-        <w:t xml:space="preserve">99. Ideaforge technologies</w:t>
+        <w:t xml:space="preserve">101. John Cockerill India: A Case Study on Decarbonisation of Steel</w:t>
       </w:r>
       <w:r>
         <w:rPr>
@@ -3538,7 +3604,7 @@
           <w:sz w:val="24"/>
           <w:szCs w:val="24"/>
         </w:rPr>
-        <w:t xml:space="preserve">100. John Cockerill India: A Case Study on Decarbonisation of Steel</w:t>
+        <w:t xml:space="preserve">102. KP Energy Ltd</w:t>
       </w:r>
       <w:r>
         <w:rPr>
@@ -3571,7 +3637,7 @@
           <w:sz w:val="24"/>
           <w:szCs w:val="24"/>
         </w:rPr>
-        <w:t xml:space="preserve">101. KP Energy Ltd</w:t>
+        <w:t xml:space="preserve">103. KP Green Engineering Ltd</w:t>
       </w:r>
       <w:r>
         <w:rPr>
@@ -3604,7 +3670,7 @@
           <w:sz w:val="24"/>
           <w:szCs w:val="24"/>
         </w:rPr>
-        <w:t xml:space="preserve">102. KP Green Engineering Ltd</w:t>
+        <w:t xml:space="preserve">104. KPI Green Energy Ltd</w:t>
       </w:r>
       <w:r>
         <w:rPr>
@@ -3637,7 +3703,7 @@
           <w:sz w:val="24"/>
           <w:szCs w:val="24"/>
         </w:rPr>
-        <w:t xml:space="preserve">103. KPI Green Energy Ltd</w:t>
+        <w:t xml:space="preserve">105. KRM Ayurveda Ltd</w:t>
       </w:r>
       <w:r>
         <w:rPr>
@@ -3670,7 +3736,7 @@
           <w:sz w:val="24"/>
           <w:szCs w:val="24"/>
         </w:rPr>
-        <w:t xml:space="preserve">104. KRM Ayurveda Ltd</w:t>
+        <w:t xml:space="preserve">106. Kamat Hotels (India) Ltd- A Possible Turnaround Story!</w:t>
       </w:r>
       <w:r>
         <w:rPr>
@@ -3703,7 +3769,7 @@
           <w:sz w:val="24"/>
           <w:szCs w:val="24"/>
         </w:rPr>
-        <w:t xml:space="preserve">105. Kamat Hotels (India) Ltd- A Possible Turnaround Story!</w:t>
+        <w:t xml:space="preserve">107. Kiri Industries: Loan reduction and demand surge</w:t>
       </w:r>
       <w:r>
         <w:rPr>
@@ -3736,7 +3802,7 @@
           <w:sz w:val="24"/>
           <w:szCs w:val="24"/>
         </w:rPr>
-        <w:t xml:space="preserve">106. Kiri Industries: Loan reduction and demand surge</w:t>
+        <w:t xml:space="preserve">108. Krishca Ltd : A SME offering steel strapping Solution</w:t>
       </w:r>
       <w:r>
         <w:rPr>
@@ -3769,7 +3835,7 @@
           <w:sz w:val="24"/>
           <w:szCs w:val="24"/>
         </w:rPr>
-        <w:t xml:space="preserve">107. Krishca Ltd : A SME offering steel strapping Solution</w:t>
+        <w:t xml:space="preserve">109. Kusumgar Ltd</w:t>
       </w:r>
       <w:r>
         <w:rPr>
@@ -3802,7 +3868,7 @@
           <w:sz w:val="24"/>
           <w:szCs w:val="24"/>
         </w:rPr>
-        <w:t xml:space="preserve">108. Kusumgar Ltd</w:t>
+        <w:t xml:space="preserve">110. Kwality Pharmaceuticals</w:t>
       </w:r>
       <w:r>
         <w:rPr>
@@ -3835,7 +3901,7 @@
           <w:sz w:val="24"/>
           <w:szCs w:val="24"/>
         </w:rPr>
-        <w:t xml:space="preserve">109. Kwality Pharmaceuticals</w:t>
+        <w:t xml:space="preserve">111. Laxmi Dental Ltd</w:t>
       </w:r>
       <w:r>
         <w:rPr>
@@ -3868,7 +3934,7 @@
           <w:sz w:val="24"/>
           <w:szCs w:val="24"/>
         </w:rPr>
-        <w:t xml:space="preserve">110. Laxmi Dental Ltd</w:t>
+        <w:t xml:space="preserve">112. MOIL Ltd</w:t>
       </w:r>
       <w:r>
         <w:rPr>
@@ -3901,7 +3967,7 @@
           <w:sz w:val="24"/>
           <w:szCs w:val="24"/>
         </w:rPr>
-        <w:t xml:space="preserve">111. MOIL Ltd</w:t>
+        <w:t xml:space="preserve">113. MV Electrosystems Ltd</w:t>
       </w:r>
       <w:r>
         <w:rPr>
@@ -3934,7 +4000,7 @@
           <w:sz w:val="24"/>
           <w:szCs w:val="24"/>
         </w:rPr>
-        <w:t xml:space="preserve">112. MV Electrosystems Ltd</w:t>
+        <w:t xml:space="preserve">114. Millworks Technologies Ltd</w:t>
       </w:r>
       <w:r>
         <w:rPr>
@@ -3967,7 +4033,7 @@
           <w:sz w:val="24"/>
           <w:szCs w:val="24"/>
         </w:rPr>
-        <w:t xml:space="preserve">113. Millworks Technologies Ltd</w:t>
+        <w:t xml:space="preserve">115. Mitsu Chem Plast Ltd</w:t>
       </w:r>
       <w:r>
         <w:rPr>
@@ -4000,7 +4066,7 @@
           <w:sz w:val="24"/>
           <w:szCs w:val="24"/>
         </w:rPr>
-        <w:t xml:space="preserve">114. Mitsu Chem Plast Ltd</w:t>
+        <w:t xml:space="preserve">116. Modern Insulators Ltd: A Porcelain Insulator Opportunity Insulating the Power Cycle while Riding India’s Transmission Boom</w:t>
       </w:r>
       <w:r>
         <w:rPr>
@@ -4033,7 +4099,7 @@
           <w:sz w:val="24"/>
           <w:szCs w:val="24"/>
         </w:rPr>
-        <w:t xml:space="preserve">115. Modern Insulators Ltd: A Porcelain Insulator Opportunity Insulating the Power Cycle while Riding India’s Transmission Boom</w:t>
+        <w:t xml:space="preserve">117. Morepen Labs</w:t>
       </w:r>
       <w:r>
         <w:rPr>
@@ -4066,7 +4132,7 @@
           <w:sz w:val="24"/>
           <w:szCs w:val="24"/>
         </w:rPr>
-        <w:t xml:space="preserve">116. Morepen Labs</w:t>
+        <w:t xml:space="preserve">118. Orchid Pharma Ltd</w:t>
       </w:r>
       <w:r>
         <w:rPr>
@@ -4099,7 +4165,7 @@
           <w:sz w:val="24"/>
           <w:szCs w:val="24"/>
         </w:rPr>
-        <w:t xml:space="preserve">117. Orchid Pharma Ltd</w:t>
+        <w:t xml:space="preserve">119. Oval Projects Engineering Ltd</w:t>
       </w:r>
       <w:r>
         <w:rPr>
@@ -4132,7 +4198,7 @@
           <w:sz w:val="24"/>
           <w:szCs w:val="24"/>
         </w:rPr>
-        <w:t xml:space="preserve">118. Oval Projects Engineering Ltd</w:t>
+        <w:t xml:space="preserve">120. P N Gadgil Jewellers Ltd</w:t>
       </w:r>
       <w:r>
         <w:rPr>
@@ -4165,7 +4231,7 @@
           <w:sz w:val="24"/>
           <w:szCs w:val="24"/>
         </w:rPr>
-        <w:t xml:space="preserve">119. P N Gadgil Jewellers Ltd</w:t>
+        <w:t xml:space="preserve">121. PNGS Gargi Fashion Jewellery Ltd</w:t>
       </w:r>
       <w:r>
         <w:rPr>
@@ -4198,7 +4264,7 @@
           <w:sz w:val="24"/>
           <w:szCs w:val="24"/>
         </w:rPr>
-        <w:t xml:space="preserve">120. PNGS Gargi Fashion Jewellery Ltd</w:t>
+        <w:t xml:space="preserve">122. Piccadily Agro Industries Ltd</w:t>
       </w:r>
       <w:r>
         <w:rPr>
@@ -4231,7 +4297,7 @@
           <w:sz w:val="24"/>
           <w:szCs w:val="24"/>
         </w:rPr>
-        <w:t xml:space="preserve">121. Piccadily Agro Industries Ltd</w:t>
+        <w:t xml:space="preserve">123. RBZ Jewellers Ltd</w:t>
       </w:r>
       <w:r>
         <w:rPr>
@@ -4264,7 +4330,7 @@
           <w:sz w:val="24"/>
           <w:szCs w:val="24"/>
         </w:rPr>
-        <w:t xml:space="preserve">122. RBZ Jewellers Ltd</w:t>
+        <w:t xml:space="preserve">124. RKEC Projects Ltd</w:t>
       </w:r>
       <w:r>
         <w:rPr>
@@ -4297,7 +4363,7 @@
           <w:sz w:val="24"/>
           <w:szCs w:val="24"/>
         </w:rPr>
-        <w:t xml:space="preserve">123. RKEC Projects Ltd</w:t>
+        <w:t xml:space="preserve">125. Rapicut Carbides Ltd.</w:t>
       </w:r>
       <w:r>
         <w:rPr>
@@ -4330,7 +4396,7 @@
           <w:sz w:val="24"/>
           <w:szCs w:val="24"/>
         </w:rPr>
-        <w:t xml:space="preserve">124. Rapicut Carbides Ltd.</w:t>
+        <w:t xml:space="preserve">126. Ratnaveer precision a newly headed steel company</w:t>
       </w:r>
       <w:r>
         <w:rPr>
@@ -4363,7 +4429,7 @@
           <w:sz w:val="24"/>
           <w:szCs w:val="24"/>
         </w:rPr>
-        <w:t xml:space="preserve">125. Ratnaveer precision a newly headed steel company</w:t>
+        <w:t xml:space="preserve">127. Shalimar Paints Ltd. -- Worth a Serious Look -- Significant Rerating Triggers Inplace</w:t>
       </w:r>
       <w:r>
         <w:rPr>
@@ -4396,7 +4462,7 @@
           <w:sz w:val="24"/>
           <w:szCs w:val="24"/>
         </w:rPr>
-        <w:t xml:space="preserve">126. Shalimar Paints Ltd. -- Worth a Serious Look -- Significant Rerating Triggers Inplace</w:t>
+        <w:t xml:space="preserve">128. Shree Refrigerations</w:t>
       </w:r>
       <w:r>
         <w:rPr>
@@ -4429,7 +4495,7 @@
           <w:sz w:val="24"/>
           <w:szCs w:val="24"/>
         </w:rPr>
-        <w:t xml:space="preserve">127. Shree Refrigerations</w:t>
+        <w:t xml:space="preserve">129. Solarium Green Energy Ltd</w:t>
       </w:r>
       <w:r>
         <w:rPr>
@@ -4462,7 +4528,7 @@
           <w:sz w:val="24"/>
           <w:szCs w:val="24"/>
         </w:rPr>
-        <w:t xml:space="preserve">128. Solarium Green Energy Ltd</w:t>
+        <w:t xml:space="preserve">130. Sonu Infratech Ltd</w:t>
       </w:r>
       <w:r>
         <w:rPr>
@@ -4495,7 +4561,7 @@
           <w:sz w:val="24"/>
           <w:szCs w:val="24"/>
         </w:rPr>
-        <w:t xml:space="preserve">129. Sonu Infratech Ltd</w:t>
+        <w:t xml:space="preserve">131. Sri Lotus Developers</w:t>
       </w:r>
       <w:r>
         <w:rPr>
@@ -4528,7 +4594,7 @@
           <w:sz w:val="24"/>
           <w:szCs w:val="24"/>
         </w:rPr>
-        <w:t xml:space="preserve">130. Sri Lotus Developers</w:t>
+        <w:t xml:space="preserve">132. Susan Electricals India Ltd</w:t>
       </w:r>
       <w:r>
         <w:rPr>
@@ -4561,7 +4627,7 @@
           <w:sz w:val="24"/>
           <w:szCs w:val="24"/>
         </w:rPr>
-        <w:t xml:space="preserve">131. Susan Electricals India Ltd</w:t>
+        <w:t xml:space="preserve">133. Swastika Castal Ltd</w:t>
       </w:r>
       <w:r>
         <w:rPr>
@@ -4594,7 +4660,7 @@
           <w:sz w:val="24"/>
           <w:szCs w:val="24"/>
         </w:rPr>
-        <w:t xml:space="preserve">132. Swastika Castal Ltd</w:t>
+        <w:t xml:space="preserve">134. Transrail Lighting Ltd</w:t>
       </w:r>
       <w:r>
         <w:rPr>
@@ -4627,7 +4693,7 @@
           <w:sz w:val="24"/>
           <w:szCs w:val="24"/>
         </w:rPr>
-        <w:t xml:space="preserve">133. Transrail Lighting Ltd</w:t>
+        <w:t xml:space="preserve">135. TruAlt Bioenergy</w:t>
       </w:r>
       <w:r>
         <w:rPr>
@@ -4660,7 +4726,7 @@
           <w:sz w:val="24"/>
           <w:szCs w:val="24"/>
         </w:rPr>
-        <w:t xml:space="preserve">134. TruAlt Bioenergy</w:t>
+        <w:t xml:space="preserve">136. Ugro Capital</w:t>
       </w:r>
       <w:r>
         <w:rPr>
@@ -4693,7 +4759,7 @@
           <w:sz w:val="24"/>
           <w:szCs w:val="24"/>
         </w:rPr>
-        <w:t xml:space="preserve">135. Ugro Capital</w:t>
+        <w:t xml:space="preserve">137. Unihealth Hospitals Ltd</w:t>
       </w:r>
       <w:r>
         <w:rPr>
@@ -4726,7 +4792,7 @@
           <w:sz w:val="24"/>
           <w:szCs w:val="24"/>
         </w:rPr>
-        <w:t xml:space="preserve">136. Unihealth Hospitals Ltd</w:t>
+        <w:t xml:space="preserve">138. Vikram Solar- One of the oldest Solar module manufacturer</w:t>
       </w:r>
       <w:r>
         <w:rPr>
@@ -4759,7 +4825,7 @@
           <w:sz w:val="24"/>
           <w:szCs w:val="24"/>
         </w:rPr>
-        <w:t xml:space="preserve">137. Vikram Solar- One of the oldest Solar module manufacturer</w:t>
+        <w:t xml:space="preserve">139. Walchandnagar Industries | Return of a Golden Era</w:t>
       </w:r>
       <w:r>
         <w:rPr>
@@ -4792,7 +4858,7 @@
           <w:sz w:val="24"/>
           <w:szCs w:val="24"/>
         </w:rPr>
-        <w:t xml:space="preserve">138. Walchandnagar Industries | Return of a Golden Era</w:t>
+        <w:t xml:space="preserve">140. Zaggle_A platform to address pain points for enterprises</w:t>
       </w:r>
       <w:r>
         <w:rPr>
@@ -4825,7 +4891,7 @@
           <w:sz w:val="24"/>
           <w:szCs w:val="24"/>
         </w:rPr>
-        <w:t xml:space="preserve">139. Zaggle_A platform to address pain points for enterprises</w:t>
+        <w:t xml:space="preserve">141. Gandhar Oil Refinery Ltd</w:t>
       </w:r>
       <w:r>
         <w:rPr>
@@ -4835,7 +4901,7 @@
           <w:sz w:val="20"/>
           <w:szCs w:val="20"/>
         </w:rPr>
-        <w:t xml:space="preserve">  —  undefined</w:t>
+        <w:t xml:space="preserve">  —  Peak-cycle refinery margin play, watch for normalization</w:t>
       </w:r>
       <w:r>
         <w:rPr>
@@ -4844,7 +4910,40 @@
         </w:rPr>
         <w:br/>
         <w:t xml:space="preserve">
-undefined</w:t>
+Peak-cycle quarter: Q1 FY27 margin expansion (Rs 28,145/kl, 3.4x vs Q1 FY26) from geopolitical supply-chain disruption (Hormuz, Middle East). Management cautious on durability; historical EBITDA margin 5-8%. Even conservative 7-9% run-rate implies 12-15x forward fair value vs 8.1x current multiple, but cycle-peak timing + margin-reversion risk warrant tier-C monitoring.</w:t>
+      </w:r>
+    </w:p>
+    <w:p>
+      <w:pPr>
+        <w:spacing w:after="160"/>
+      </w:pPr>
+      <w:r>
+        <w:rPr>
+          <w:b/>
+          <w:bCs/>
+          <w:sz w:val="24"/>
+          <w:szCs w:val="24"/>
+        </w:rPr>
+        <w:t xml:space="preserve">142. AGI Greenpac Ltd</w:t>
+      </w:r>
+      <w:r>
+        <w:rPr>
+          <w:i/>
+          <w:iCs/>
+          <w:color w:val="666666"/>
+          <w:sz w:val="20"/>
+          <w:szCs w:val="20"/>
+        </w:rPr>
+        <w:t xml:space="preserve">  —  Glass-packaging tailwind + capex-backed ROCE expansion path</w:t>
+      </w:r>
+      <w:r>
+        <w:rPr>
+          <w:sz w:val="20"/>
+          <w:szCs w:val="20"/>
+        </w:rPr>
+        <w:br/>
+        <w:t xml:space="preserve">
+Glass-packaging tailwind (e-commerce, FMCG) + capex-backed ROCE expansion (FY27 guidance 8-10% volume growth; FY28-FY29 new product capacity for higher-margin specialty glass, ROCE target 25%+). Q1 FY27 revenue +25% YoY, PAT +41% YoY; 14.2x P/E on 28% PAT growth is undemanding on near-term flow, but implies market pricing derating or mid-teens growth once capex lands. Neutral gap on fair value; watch input-cost inflation (soda ash, energy) and capex-to-payoff timing.</w:t>
       </w:r>
     </w:p>
     <w:p>
@@ -6966,6 +7065,37 @@
                 <w:bCs w:val="false"/>
               </w:rPr>
               <w:t xml:space="preserve">HIGH CAUTION (2026-09-18 deep dive): Infomerics placed Rs49cr bank facilities on Rating Watch-Negative (Apr-2026) citing WC pressure, high bank-limit utilisation, and ~85-90% Middle-East export concentration. Company raised Rs27.6cr via a dilutive preferential warrant issue (Jun-2026) explicitly earmarked partly for working capital - corroborates rather than resolves the rating flag. Promoter holding (72.8%) locked in to dilute to ~61.4% once warrants convert within 18mo. FY26 revenue growth only +11.5% (softer than the one strong Q1 FY27 print +22.7%) - inflection narrative still rests on one quarter. Genuine positives (new Mumbai plant live Aug-2026, 15% dividend) don't offset the new credit-rating flag. Conviction Medium -&gt; Low-Medium.</w:t>
+            </w:r>
+          </w:p>
+        </w:tc>
+      </w:tr>
+      <w:tr>
+        <w:tc>
+          <w:tcPr>
+            <w:tcW w:type="dxa" w:w="2600"/>
+          </w:tcPr>
+          <w:p>
+            <w:r>
+              <w:rPr>
+                <w:b/>
+                <w:bCs/>
+                <w:color w:val="B8860B"/>
+              </w:rPr>
+              <w:t xml:space="preserve">GV Electricals Ltd</w:t>
+            </w:r>
+          </w:p>
+        </w:tc>
+        <w:tc>
+          <w:tcPr>
+            <w:tcW w:type="dxa" w:w="6400"/>
+          </w:tcPr>
+          <w:p>
+            <w:r>
+              <w:rPr>
+                <w:b w:val="false"/>
+                <w:bCs w:val="false"/>
+              </w:rPr>
+              <w:t xml:space="preserve">HIGH CAUTION: working capital deterioration (debtor +33d, FCF negative despite profit). WC stabilization required before thesis can be reassessed.</w:t>
             </w:r>
           </w:p>
         </w:tc>

</xml_diff>